<commit_message>
Documentação final - 3.2 até 5.0
</commit_message>
<xml_diff>
--- a/Documentação/Padrao-Documentacao-PI-Grupo6.docx
+++ b/Documentação/Padrao-Documentacao-PI-Grupo6.docx
@@ -1,6 +1,6 @@
 
 <file path=word/document.xml><?xml version="1.0" encoding="utf-8"?>
-<w:document xmlns:wpc="http://schemas.microsoft.com/office/word/2010/wordprocessingCanvas" xmlns:cx="http://schemas.microsoft.com/office/drawing/2014/chartex" xmlns:cx1="http://schemas.microsoft.com/office/drawing/2015/9/8/chartex" xmlns:cx2="http://schemas.microsoft.com/office/drawing/2015/10/21/chartex" xmlns:cx3="http://schemas.microsoft.com/office/drawing/2016/5/9/chartex" xmlns:cx4="http://schemas.microsoft.com/office/drawing/2016/5/10/chartex" xmlns:cx5="http://schemas.microsoft.com/office/drawing/2016/5/11/chartex" xmlns:cx6="http://schemas.microsoft.com/office/drawing/2016/5/12/chartex" xmlns:cx7="http://schemas.microsoft.com/office/drawing/2016/5/13/chartex" xmlns:cx8="http://schemas.microsoft.com/office/drawing/2016/5/14/chartex" xmlns:mc="http://schemas.openxmlformats.org/markup-compatibility/2006" xmlns:aink="http://schemas.microsoft.com/office/drawing/2016/ink" xmlns:am3d="http://schemas.microsoft.com/office/drawing/2017/model3d" xmlns:o="urn:schemas-microsoft-com:office:office" xmlns:r="http://schemas.openxmlformats.org/officeDocument/2006/relationships" xmlns:m="http://schemas.openxmlformats.org/officeDocument/2006/math" xmlns:v="urn:schemas-microsoft-com:vml" xmlns:wp14="http://schemas.microsoft.com/office/word/2010/wordprocessingDrawing" xmlns:wp="http://schemas.openxmlformats.org/drawingml/2006/wordprocessingDrawing" xmlns:w10="urn:schemas-microsoft-com:office:word" xmlns:w="http://schemas.openxmlformats.org/wordprocessingml/2006/main" xmlns:w14="http://schemas.microsoft.com/office/word/2010/wordml" xmlns:w15="http://schemas.microsoft.com/office/word/2012/wordml" xmlns:w16cex="http://schemas.microsoft.com/office/word/2018/wordml/cex" xmlns:w16cid="http://schemas.microsoft.com/office/word/2016/wordml/cid" xmlns:w16="http://schemas.microsoft.com/office/word/2018/wordml" xmlns:w16sdtdh="http://schemas.microsoft.com/office/word/2020/wordml/sdtdatahash" xmlns:w16se="http://schemas.microsoft.com/office/word/2015/wordml/symex" xmlns:wpg="http://schemas.microsoft.com/office/word/2010/wordprocessingGroup" xmlns:wpi="http://schemas.microsoft.com/office/word/2010/wordprocessingInk" xmlns:wne="http://schemas.microsoft.com/office/word/2006/wordml" xmlns:wps="http://schemas.microsoft.com/office/word/2010/wordprocessingShape" mc:Ignorable="w14 w15 w16se w16cid w16 w16cex w16sdtdh wp14">
+<w:document xmlns:wpc="http://schemas.microsoft.com/office/word/2010/wordprocessingCanvas" xmlns:cx="http://schemas.microsoft.com/office/drawing/2014/chartex" xmlns:cx1="http://schemas.microsoft.com/office/drawing/2015/9/8/chartex" xmlns:cx2="http://schemas.microsoft.com/office/drawing/2015/10/21/chartex" xmlns:cx3="http://schemas.microsoft.com/office/drawing/2016/5/9/chartex" xmlns:cx4="http://schemas.microsoft.com/office/drawing/2016/5/10/chartex" xmlns:cx5="http://schemas.microsoft.com/office/drawing/2016/5/11/chartex" xmlns:cx6="http://schemas.microsoft.com/office/drawing/2016/5/12/chartex" xmlns:cx7="http://schemas.microsoft.com/office/drawing/2016/5/13/chartex" xmlns:cx8="http://schemas.microsoft.com/office/drawing/2016/5/14/chartex" xmlns:mc="http://schemas.openxmlformats.org/markup-compatibility/2006" xmlns:aink="http://schemas.microsoft.com/office/drawing/2016/ink" xmlns:am3d="http://schemas.microsoft.com/office/drawing/2017/model3d" xmlns:o="urn:schemas-microsoft-com:office:office" xmlns:oel="http://schemas.microsoft.com/office/2019/extlst" xmlns:r="http://schemas.openxmlformats.org/officeDocument/2006/relationships" xmlns:m="http://schemas.openxmlformats.org/officeDocument/2006/math" xmlns:v="urn:schemas-microsoft-com:vml" xmlns:wp14="http://schemas.microsoft.com/office/word/2010/wordprocessingDrawing" xmlns:wp="http://schemas.openxmlformats.org/drawingml/2006/wordprocessingDrawing" xmlns:w10="urn:schemas-microsoft-com:office:word" xmlns:w="http://schemas.openxmlformats.org/wordprocessingml/2006/main" xmlns:w14="http://schemas.microsoft.com/office/word/2010/wordml" xmlns:w15="http://schemas.microsoft.com/office/word/2012/wordml" xmlns:w16cex="http://schemas.microsoft.com/office/word/2018/wordml/cex" xmlns:w16cid="http://schemas.microsoft.com/office/word/2016/wordml/cid" xmlns:w16="http://schemas.microsoft.com/office/word/2018/wordml" xmlns:w16du="http://schemas.microsoft.com/office/word/2023/wordml/word16du" xmlns:w16sdtdh="http://schemas.microsoft.com/office/word/2020/wordml/sdtdatahash" xmlns:w16sdtfl="http://schemas.microsoft.com/office/word/2024/wordml/sdtformatlock" xmlns:w16se="http://schemas.microsoft.com/office/word/2015/wordml/symex" xmlns:wpg="http://schemas.microsoft.com/office/word/2010/wordprocessingGroup" xmlns:wpi="http://schemas.microsoft.com/office/word/2010/wordprocessingInk" xmlns:wne="http://schemas.microsoft.com/office/word/2006/wordml" xmlns:wps="http://schemas.microsoft.com/office/word/2010/wordprocessingShape" mc:Ignorable="w14 w15 w16se w16cid w16 w16cex w16sdtdh w16sdtfl w16du wp14">
   <w:body>
     <w:p/>
     <w:p>
@@ -164,21 +164,12 @@
           <w:bCs/>
         </w:rPr>
       </w:pPr>
-      <w:proofErr w:type="gramStart"/>
       <w:r>
         <w:rPr>
           <w:b/>
           <w:bCs/>
         </w:rPr>
-        <w:t>Grupo(</w:t>
-      </w:r>
-      <w:proofErr w:type="gramEnd"/>
-      <w:r>
-        <w:rPr>
-          <w:b/>
-          <w:bCs/>
-        </w:rPr>
-        <w:t>6) / Nome da Empresa: Pró Pilates</w:t>
+        <w:t>Grupo(6) / Nome da Empresa: Pró Pilates</w:t>
       </w:r>
     </w:p>
     <w:p>
@@ -546,7 +537,7 @@
           </mc:Choice>
           <mc:Fallback>
             <w:pict>
-              <v:rect w14:anchorId="4C013944" id="Retângulo 1" o:spid="_x0000_s1026" style="position:absolute;left:0;text-align:left;margin-left:-9.25pt;margin-top:8.7pt;width:442.25pt;height:74.75pt;z-index:-251658240;visibility:visible;mso-wrap-style:square;mso-wrap-distance-left:0;mso-wrap-distance-top:0;mso-wrap-distance-right:0;mso-wrap-distance-bottom:0;mso-position-horizontal:absolute;mso-position-horizontal-relative:text;mso-position-vertical:absolute;mso-position-vertical-relative:text;v-text-anchor:middle" o:gfxdata="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" fillcolor="white [3201]" strokecolor="black [3200]" strokeweight="2pt">
+              <v:rect w14:anchorId="4C013944" id="Retângulo 1" o:spid="_x0000_s1026" style="position:absolute;left:0;text-align:left;margin-left:-9.25pt;margin-top:8.7pt;width:442.25pt;height:74.75pt;z-index:-251658240;visibility:visible;mso-wrap-style:square;mso-wrap-distance-left:0;mso-wrap-distance-top:0;mso-wrap-distance-right:0;mso-wrap-distance-bottom:0;mso-position-horizontal:absolute;mso-position-horizontal-relative:text;mso-position-vertical:absolute;mso-position-vertical-relative:text;v-text-anchor:middle" o:gfxdata="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" fillcolor="white [3201]" strokecolor="black [3200]" strokeweight="2pt">
                 <v:stroke startarrowwidth="narrow" startarrowlength="short" endarrowwidth="narrow" endarrowlength="short" joinstyle="round"/>
                 <v:textbox inset="2.53958mm,1.2694mm,2.53958mm,1.2694mm">
                   <w:txbxContent>
@@ -672,7 +663,7 @@
           </mc:Choice>
           <mc:Fallback>
             <w:pict>
-              <v:rect w14:anchorId="778E8592" id="Retângulo 2" o:spid="_x0000_s1027" style="position:absolute;left:0;text-align:left;margin-left:-9pt;margin-top:14.25pt;width:442.25pt;height:101.25pt;z-index:-251657216;visibility:visible;mso-wrap-style:square;mso-width-percent:0;mso-height-percent:0;mso-wrap-distance-left:0;mso-wrap-distance-top:0;mso-wrap-distance-right:0;mso-wrap-distance-bottom:0;mso-position-horizontal:absolute;mso-position-horizontal-relative:text;mso-position-vertical:absolute;mso-position-vertical-relative:text;mso-width-percent:0;mso-height-percent:0;mso-width-relative:margin;mso-height-relative:margin;v-text-anchor:middle" o:gfxdata="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" fillcolor="white [3201]" strokecolor="black [3200]" strokeweight="2pt">
+              <v:rect w14:anchorId="778E8592" id="Retângulo 2" o:spid="_x0000_s1027" style="position:absolute;left:0;text-align:left;margin-left:-9pt;margin-top:14.25pt;width:442.25pt;height:101.25pt;z-index:-251657216;visibility:visible;mso-wrap-style:square;mso-width-percent:0;mso-height-percent:0;mso-wrap-distance-left:0;mso-wrap-distance-top:0;mso-wrap-distance-right:0;mso-wrap-distance-bottom:0;mso-position-horizontal:absolute;mso-position-horizontal-relative:text;mso-position-vertical:absolute;mso-position-vertical-relative:text;mso-width-percent:0;mso-height-percent:0;mso-width-relative:margin;mso-height-relative:margin;v-text-anchor:middle" o:gfxdata="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" fillcolor="white [3201]" strokecolor="black [3200]" strokeweight="2pt">
                 <v:stroke startarrowwidth="narrow" startarrowlength="short" endarrowwidth="narrow" endarrowlength="short" joinstyle="round"/>
                 <v:textbox inset="2.53958mm,1.2694mm,2.53958mm,1.2694mm">
                   <w:txbxContent>
@@ -1105,7 +1096,6 @@
           <w:docPartUnique/>
         </w:docPartObj>
       </w:sdtPr>
-      <w:sdtEndPr/>
       <w:sdtContent>
         <w:p>
           <w:pPr>
@@ -2641,7 +2631,7 @@
         <w:pStyle w:val="Ttulo1"/>
         <w:numPr>
           <w:ilvl w:val="0"/>
-          <w:numId w:val="3"/>
+          <w:numId w:val="1"/>
         </w:numPr>
       </w:pPr>
       <w:bookmarkStart w:id="6" w:name="_heading=h.iyloxdsu6zdj" w:colFirst="0" w:colLast="0"/>
@@ -4509,7 +4499,7 @@
               <w:jc w:val="center"/>
             </w:pPr>
             <w:r>
-              <w:t>X</w:t>
+              <w:t>OK</w:t>
             </w:r>
           </w:p>
         </w:tc>
@@ -4731,7 +4721,7 @@
               <w:jc w:val="center"/>
             </w:pPr>
             <w:r>
-              <w:t>X</w:t>
+              <w:t>OK</w:t>
             </w:r>
           </w:p>
         </w:tc>
@@ -4944,7 +4934,7 @@
               <w:jc w:val="center"/>
             </w:pPr>
             <w:r>
-              <w:t>X</w:t>
+              <w:t>OK</w:t>
             </w:r>
           </w:p>
         </w:tc>
@@ -5141,7 +5131,7 @@
               <w:jc w:val="center"/>
             </w:pPr>
             <w:r>
-              <w:t>X</w:t>
+              <w:t>OK</w:t>
             </w:r>
           </w:p>
         </w:tc>
@@ -5166,7 +5156,7 @@
               <w:jc w:val="center"/>
             </w:pPr>
             <w:r>
-              <w:t>X</w:t>
+              <w:t>OK</w:t>
             </w:r>
           </w:p>
         </w:tc>
@@ -5341,7 +5331,7 @@
               <w:jc w:val="center"/>
             </w:pPr>
             <w:r>
-              <w:t>X</w:t>
+              <w:t>OK</w:t>
             </w:r>
           </w:p>
         </w:tc>
@@ -5366,7 +5356,7 @@
               <w:jc w:val="center"/>
             </w:pPr>
             <w:r>
-              <w:t>X</w:t>
+              <w:t>OK</w:t>
             </w:r>
           </w:p>
         </w:tc>
@@ -5391,7 +5381,7 @@
               <w:jc w:val="center"/>
             </w:pPr>
             <w:r>
-              <w:t>X</w:t>
+              <w:t>OK</w:t>
             </w:r>
           </w:p>
         </w:tc>
@@ -5416,7 +5406,7 @@
               <w:jc w:val="center"/>
             </w:pPr>
             <w:r>
-              <w:t>X</w:t>
+              <w:t>OK</w:t>
             </w:r>
           </w:p>
         </w:tc>
@@ -5569,7 +5559,7 @@
               <w:jc w:val="center"/>
             </w:pPr>
             <w:r>
-              <w:t>X</w:t>
+              <w:t>OK</w:t>
             </w:r>
           </w:p>
         </w:tc>
@@ -5594,7 +5584,7 @@
               <w:jc w:val="center"/>
             </w:pPr>
             <w:r>
-              <w:t>X</w:t>
+              <w:t>OK</w:t>
             </w:r>
           </w:p>
         </w:tc>
@@ -5619,7 +5609,7 @@
               <w:jc w:val="center"/>
             </w:pPr>
             <w:r>
-              <w:t>X</w:t>
+              <w:t>OK</w:t>
             </w:r>
           </w:p>
         </w:tc>
@@ -5772,7 +5762,7 @@
               <w:jc w:val="center"/>
             </w:pPr>
             <w:r>
-              <w:t>X</w:t>
+              <w:t>OK</w:t>
             </w:r>
           </w:p>
         </w:tc>
@@ -5797,7 +5787,7 @@
               <w:jc w:val="center"/>
             </w:pPr>
             <w:r>
-              <w:t>X</w:t>
+              <w:t>OK</w:t>
             </w:r>
           </w:p>
         </w:tc>
@@ -5822,7 +5812,7 @@
               <w:jc w:val="center"/>
             </w:pPr>
             <w:r>
-              <w:t>X</w:t>
+              <w:t>OK</w:t>
             </w:r>
           </w:p>
         </w:tc>
@@ -5847,7 +5837,7 @@
               <w:jc w:val="center"/>
             </w:pPr>
             <w:r>
-              <w:t>X</w:t>
+              <w:t>OK</w:t>
             </w:r>
           </w:p>
         </w:tc>
@@ -5941,7 +5931,7 @@
               <w:jc w:val="center"/>
             </w:pPr>
             <w:r>
-              <w:t>X</w:t>
+              <w:t>OK</w:t>
             </w:r>
           </w:p>
         </w:tc>
@@ -5960,7 +5950,7 @@
               <w:jc w:val="center"/>
             </w:pPr>
             <w:r>
-              <w:t>X</w:t>
+              <w:t>OK</w:t>
             </w:r>
           </w:p>
         </w:tc>
@@ -5985,7 +5975,7 @@
               <w:jc w:val="center"/>
             </w:pPr>
             <w:r>
-              <w:t>X</w:t>
+              <w:t>OK</w:t>
             </w:r>
           </w:p>
         </w:tc>
@@ -6010,7 +6000,7 @@
               <w:jc w:val="center"/>
             </w:pPr>
             <w:r>
-              <w:t>X</w:t>
+              <w:t>OK</w:t>
             </w:r>
           </w:p>
         </w:tc>
@@ -6035,7 +6025,7 @@
               <w:jc w:val="center"/>
             </w:pPr>
             <w:r>
-              <w:t>X</w:t>
+              <w:t>OK</w:t>
             </w:r>
           </w:p>
         </w:tc>
@@ -6060,7 +6050,7 @@
               <w:jc w:val="center"/>
             </w:pPr>
             <w:r>
-              <w:t>X</w:t>
+              <w:t>OK</w:t>
             </w:r>
           </w:p>
         </w:tc>
@@ -6191,7 +6181,7 @@
               <w:jc w:val="center"/>
             </w:pPr>
             <w:r>
-              <w:t>X</w:t>
+              <w:t>OK</w:t>
             </w:r>
           </w:p>
         </w:tc>
@@ -6216,7 +6206,7 @@
               <w:jc w:val="center"/>
             </w:pPr>
             <w:r>
-              <w:t>X</w:t>
+              <w:t>OK</w:t>
             </w:r>
           </w:p>
         </w:tc>
@@ -6241,7 +6231,7 @@
               <w:jc w:val="center"/>
             </w:pPr>
             <w:r>
-              <w:t>X</w:t>
+              <w:t>OK</w:t>
             </w:r>
           </w:p>
         </w:tc>
@@ -6266,7 +6256,7 @@
               <w:jc w:val="center"/>
             </w:pPr>
             <w:r>
-              <w:t>X</w:t>
+              <w:t>OK</w:t>
             </w:r>
           </w:p>
         </w:tc>
@@ -6463,7 +6453,7 @@
               <w:jc w:val="center"/>
             </w:pPr>
             <w:r>
-              <w:t>X</w:t>
+              <w:t>OK</w:t>
             </w:r>
           </w:p>
         </w:tc>
@@ -6628,7 +6618,7 @@
               <w:jc w:val="center"/>
             </w:pPr>
             <w:r>
-              <w:t>X</w:t>
+              <w:t>OK</w:t>
             </w:r>
           </w:p>
         </w:tc>
@@ -6752,23 +6742,90 @@
       </w:r>
     </w:p>
     <w:p>
-      <w:pPr>
-        <w:rPr>
-          <w:u w:val="single"/>
-        </w:rPr>
-      </w:pPr>
-      <w:r>
-        <w:t xml:space="preserve"> O que será armazenado? (Ex: Nome (Texto), Data </w:t>
-      </w:r>
-      <w:proofErr w:type="spellStart"/>
-      <w:r>
-        <w:t>Nasc</w:t>
-      </w:r>
-      <w:proofErr w:type="spellEnd"/>
-      <w:r>
-        <w:t xml:space="preserve"> (Data), Data de Cadastro (Data)).</w:t>
-      </w:r>
-    </w:p>
+      <w:r>
+        <w:t>ID do aluno (Número)</w:t>
+      </w:r>
+    </w:p>
+    <w:p>
+      <w:r>
+        <w:t>Nome completo (Texto)</w:t>
+      </w:r>
+    </w:p>
+    <w:p>
+      <w:r>
+        <w:t>Data de nascimento (Data)</w:t>
+      </w:r>
+    </w:p>
+    <w:p>
+      <w:r>
+        <w:t>Telefone (Texto)</w:t>
+      </w:r>
+    </w:p>
+    <w:p>
+      <w:r>
+        <w:t>E-mail (Texto)</w:t>
+      </w:r>
+    </w:p>
+    <w:p>
+      <w:r>
+        <w:t>Data de cadastro (Data)</w:t>
+      </w:r>
+    </w:p>
+    <w:p>
+      <w:r>
+        <w:t>Plano contratado (Texto)</w:t>
+      </w:r>
+    </w:p>
+    <w:p>
+      <w:r>
+        <w:t>Data da aula (Data)</w:t>
+      </w:r>
+    </w:p>
+    <w:p>
+      <w:r>
+        <w:t>Horário da aula (Hora)</w:t>
+      </w:r>
+    </w:p>
+    <w:p>
+      <w:r>
+        <w:t>Presença do aluno (Sim/Não)</w:t>
+      </w:r>
+    </w:p>
+    <w:p>
+      <w:r>
+        <w:t>Observações médicas do aluno (Texto)</w:t>
+      </w:r>
+    </w:p>
+    <w:p/>
+    <w:p/>
+    <w:p/>
+    <w:p/>
+    <w:p/>
+    <w:p/>
+    <w:p/>
+    <w:p/>
+    <w:p/>
+    <w:p/>
+    <w:p/>
+    <w:p/>
+    <w:p/>
+    <w:p/>
+    <w:p/>
+    <w:p/>
+    <w:p/>
+    <w:p/>
+    <w:p/>
+    <w:p/>
+    <w:p/>
+    <w:p/>
+    <w:p/>
+    <w:p/>
+    <w:p/>
+    <w:p/>
+    <w:p/>
+    <w:p/>
+    <w:p/>
+    <w:p/>
     <w:p/>
     <w:p>
       <w:pPr>
@@ -6778,287 +6835,8 @@
       <w:bookmarkStart w:id="16" w:name="_heading=h.83z7gcxzzbxi" w:colFirst="0" w:colLast="0"/>
       <w:bookmarkEnd w:id="16"/>
       <w:r>
+        <w:lastRenderedPageBreak/>
         <w:t xml:space="preserve">3.3 Protótipo de Baixa Fidelidade </w:t>
-      </w:r>
-    </w:p>
-    <w:p>
-      <w:r>
-        <w:t>Apresentar os desenhos (</w:t>
-      </w:r>
-      <w:proofErr w:type="spellStart"/>
-      <w:r>
-        <w:t>wireframes</w:t>
-      </w:r>
-      <w:proofErr w:type="spellEnd"/>
-      <w:r>
-        <w:t xml:space="preserve">) das telas principais. Pode ser feito à mão ou em ferramentas como </w:t>
-      </w:r>
-      <w:proofErr w:type="spellStart"/>
-      <w:r>
-        <w:t>Figma</w:t>
-      </w:r>
-      <w:proofErr w:type="spellEnd"/>
-      <w:r>
-        <w:t>/Marvel App. O foco é o fluxo, não a beleza.</w:t>
-      </w:r>
-    </w:p>
-    <w:p/>
-    <w:p>
-      <w:pPr>
-        <w:pStyle w:val="Ttulo2"/>
-        <w:ind w:left="0"/>
-      </w:pPr>
-      <w:bookmarkStart w:id="17" w:name="_heading=h.xgm67tbi0uvr" w:colFirst="0" w:colLast="0"/>
-      <w:bookmarkEnd w:id="17"/>
-      <w:r>
-        <w:t>3.4 Recursos e Ferramentas</w:t>
-      </w:r>
-    </w:p>
-    <w:p>
-      <w:r>
-        <w:t>O que foi usado para criar o protótipo e a documentação. Liste os hardwares e softwares utilizados (</w:t>
-      </w:r>
-      <w:proofErr w:type="spellStart"/>
-      <w:r>
-        <w:t>ex</w:t>
-      </w:r>
-      <w:proofErr w:type="spellEnd"/>
-      <w:r>
-        <w:t xml:space="preserve">: VS </w:t>
-      </w:r>
-      <w:proofErr w:type="spellStart"/>
-      <w:r>
-        <w:t>Code</w:t>
-      </w:r>
-      <w:proofErr w:type="spellEnd"/>
-      <w:r>
-        <w:t>, Draw.io, Microsoft Office).</w:t>
-      </w:r>
-    </w:p>
-    <w:p>
-      <w:pPr>
-        <w:jc w:val="left"/>
-      </w:pPr>
-      <w:r>
-        <w:br w:type="page"/>
-      </w:r>
-    </w:p>
-    <w:p>
-      <w:pPr>
-        <w:pStyle w:val="Ttulo1"/>
-        <w:numPr>
-          <w:ilvl w:val="0"/>
-          <w:numId w:val="1"/>
-        </w:numPr>
-      </w:pPr>
-      <w:bookmarkStart w:id="18" w:name="_heading=h.a8y3bfa3q6dr" w:colFirst="0" w:colLast="0"/>
-      <w:bookmarkEnd w:id="18"/>
-      <w:r>
-        <w:lastRenderedPageBreak/>
-        <w:t>Reflexão Socioemocional</w:t>
-      </w:r>
-    </w:p>
-    <w:p>
-      <w:pPr>
-        <w:pStyle w:val="Ttulo2"/>
-        <w:ind w:firstLine="142"/>
-      </w:pPr>
-      <w:bookmarkStart w:id="19" w:name="_heading=h.ndjid1pp2ys" w:colFirst="0" w:colLast="0"/>
-      <w:bookmarkEnd w:id="19"/>
-      <w:r>
-        <w:t>4.1 Autoavaliação da Equipe</w:t>
-      </w:r>
-    </w:p>
-    <w:p>
-      <w:pPr>
-        <w:pStyle w:val="Ttulo2"/>
-        <w:ind w:firstLine="142"/>
-        <w:rPr>
-          <w:b w:val="0"/>
-          <w:bCs w:val="0"/>
-          <w:sz w:val="22"/>
-          <w:szCs w:val="22"/>
-        </w:rPr>
-      </w:pPr>
-      <w:bookmarkStart w:id="20" w:name="_heading=h.9gkf758hs31l" w:colFirst="0" w:colLast="0"/>
-      <w:bookmarkEnd w:id="20"/>
-      <w:r>
-        <w:rPr>
-          <w:b w:val="0"/>
-          <w:bCs w:val="0"/>
-          <w:sz w:val="22"/>
-          <w:szCs w:val="22"/>
-        </w:rPr>
-        <w:t>Como lidaram com feedbacks negativos?</w:t>
-      </w:r>
-    </w:p>
-    <w:p>
-      <w:pPr>
-        <w:pStyle w:val="Ttulo2"/>
-        <w:ind w:firstLine="142"/>
-        <w:rPr>
-          <w:b w:val="0"/>
-          <w:bCs w:val="0"/>
-          <w:sz w:val="22"/>
-          <w:szCs w:val="22"/>
-        </w:rPr>
-      </w:pPr>
-      <w:bookmarkStart w:id="21" w:name="_heading=h.ge3v0w1x3oqp" w:colFirst="0" w:colLast="0"/>
-      <w:bookmarkEnd w:id="21"/>
-      <w:r>
-        <w:rPr>
-          <w:b w:val="0"/>
-          <w:bCs w:val="0"/>
-          <w:sz w:val="22"/>
-          <w:szCs w:val="22"/>
-        </w:rPr>
-        <w:t>Quem buscou conhecimento extra para resolver um problema técnico?</w:t>
-      </w:r>
-    </w:p>
-    <w:p>
-      <w:pPr>
-        <w:pStyle w:val="Ttulo2"/>
-        <w:ind w:firstLine="142"/>
-        <w:rPr>
-          <w:b w:val="0"/>
-          <w:bCs w:val="0"/>
-          <w:sz w:val="22"/>
-          <w:szCs w:val="22"/>
-        </w:rPr>
-      </w:pPr>
-      <w:bookmarkStart w:id="22" w:name="_heading=h.ffqdjd8rvo2v" w:colFirst="0" w:colLast="0"/>
-      <w:bookmarkEnd w:id="22"/>
-      <w:r>
-        <w:rPr>
-          <w:b w:val="0"/>
-          <w:bCs w:val="0"/>
-          <w:sz w:val="22"/>
-          <w:szCs w:val="22"/>
-        </w:rPr>
-        <w:t>Inteligência Interpessoal: Como gerenciaram o tempo e o temperamento do grupo?</w:t>
-      </w:r>
-    </w:p>
-    <w:p>
-      <w:pPr>
-        <w:pStyle w:val="Ttulo2"/>
-        <w:ind w:firstLine="142"/>
-        <w:rPr>
-          <w:b w:val="0"/>
-          <w:bCs w:val="0"/>
-          <w:sz w:val="22"/>
-          <w:szCs w:val="22"/>
-        </w:rPr>
-      </w:pPr>
-    </w:p>
-    <w:p>
-      <w:pPr>
-        <w:pStyle w:val="Ttulo2"/>
-        <w:ind w:firstLine="142"/>
-      </w:pPr>
-      <w:bookmarkStart w:id="23" w:name="_heading=h.930z38cf44x6" w:colFirst="0" w:colLast="0"/>
-      <w:bookmarkEnd w:id="23"/>
-      <w:r>
-        <w:t>4.2 Relato de Experiência na Comunidade</w:t>
-      </w:r>
-    </w:p>
-    <w:p>
-      <w:r>
-        <w:rPr>
-          <w:highlight w:val="yellow"/>
-        </w:rPr>
-        <w:t>A visita ao Studio de Pilates permitiu uma compreensão profunda de que o desenvolvimento de software vai além da codificação; trata-se de resolver problemas humanos reais. Ao observar a proprietária gerindo sozinha todas as pontas do negócio, percebemos que a simplicidade é o requisito mais valioso. A transição da sala de aula para o ambiente real nos mostrou que uma solução tecnológica, por mais simples que seja (como a separação de contas e a digitalização da agenda), pode ser o diferencial para a sobrevivência e crescimento de um microempreendedor. Essa experiência reforçou nosso papel como agentes de transformação digital na comunidade local.</w:t>
-      </w:r>
-      <w:r>
-        <w:br w:type="page"/>
-      </w:r>
-    </w:p>
-    <w:p>
-      <w:pPr>
-        <w:pStyle w:val="Ttulo1"/>
-        <w:numPr>
-          <w:ilvl w:val="0"/>
-          <w:numId w:val="1"/>
-        </w:numPr>
-      </w:pPr>
-      <w:bookmarkStart w:id="24" w:name="_heading=h.wr6menp38s79" w:colFirst="0" w:colLast="0"/>
-      <w:bookmarkEnd w:id="24"/>
-      <w:r>
-        <w:lastRenderedPageBreak/>
-        <w:t>Considerações Finais</w:t>
-      </w:r>
-    </w:p>
-    <w:p/>
-    <w:p>
-      <w:r>
-        <w:t>Conclusão: Concluir o trabalho e destacar aprendizados</w:t>
-      </w:r>
-    </w:p>
-    <w:p>
-      <w:r>
-        <w:t>Contribuições Individuais: Descrever as contribuições individuais de cada membro da equipe</w:t>
-      </w:r>
-    </w:p>
-    <w:p/>
-    <w:p>
-      <w:pPr>
-        <w:pStyle w:val="Ttulo1"/>
-      </w:pPr>
-      <w:bookmarkStart w:id="25" w:name="_heading=h.nqm818qgse8j" w:colFirst="0" w:colLast="0"/>
-      <w:bookmarkEnd w:id="25"/>
-      <w:r>
-        <w:t>Referências</w:t>
-      </w:r>
-    </w:p>
-    <w:p/>
-    <w:p/>
-    <w:p>
-      <w:pPr>
-        <w:pStyle w:val="Ttulo1"/>
-        <w:ind w:left="710" w:firstLine="0"/>
-      </w:pPr>
-      <w:bookmarkStart w:id="26" w:name="_heading=h.lsdn64ez1zwi" w:colFirst="0" w:colLast="0"/>
-      <w:bookmarkEnd w:id="26"/>
-      <w:r>
-        <w:t>Anexo I - Diário de bordo</w:t>
-      </w:r>
-    </w:p>
-    <w:p>
-      <w:r>
-        <w:rPr>
-          <w:b/>
-          <w:bCs/>
-        </w:rPr>
-        <w:t>Virtual:</w:t>
-      </w:r>
-      <w:r>
-        <w:t xml:space="preserve"> Feito pelo grupo e inserido em uma pasta chamada Diário de Bordo dentro do repositório.</w:t>
-      </w:r>
-    </w:p>
-    <w:p>
-      <w:pPr>
-        <w:pStyle w:val="Ttulo1"/>
-        <w:ind w:left="720" w:firstLine="0"/>
-      </w:pPr>
-      <w:bookmarkStart w:id="27" w:name="_heading=h.l3j0u9oay8ct" w:colFirst="0" w:colLast="0"/>
-      <w:bookmarkEnd w:id="27"/>
-      <w:r>
-        <w:t>Anexo II – Cronograma efetivo</w:t>
-      </w:r>
-    </w:p>
-    <w:p>
-      <w:pPr>
-        <w:pStyle w:val="Ttulo1"/>
-        <w:ind w:left="720" w:firstLine="0"/>
-      </w:pPr>
-      <w:bookmarkStart w:id="28" w:name="_heading=h.3ykr8cde8xx5" w:colFirst="0" w:colLast="0"/>
-      <w:bookmarkEnd w:id="28"/>
-      <w:r>
-        <w:t>Anexo III – Evidências</w:t>
-      </w:r>
-    </w:p>
-    <w:p>
-      <w:r>
-        <w:t>Imagens das visitas, ações realizadas, participantes externos, prints.</w:t>
       </w:r>
     </w:p>
     <w:p/>
@@ -7067,12 +6845,11 @@
         <w:rPr>
           <w:noProof/>
         </w:rPr>
-        <w:lastRenderedPageBreak/>
         <w:drawing>
-          <wp:inline distT="0" distB="0" distL="0" distR="0" wp14:anchorId="2277EFF6" wp14:editId="358858EC">
-            <wp:extent cx="5733415" cy="2647950"/>
-            <wp:effectExtent l="0" t="317" r="317" b="318"/>
-            <wp:docPr id="215174488" name="Imagem 8"/>
+          <wp:inline distT="0" distB="0" distL="0" distR="0" wp14:anchorId="65E39A52" wp14:editId="2E7FAA88">
+            <wp:extent cx="5733415" cy="3225165"/>
+            <wp:effectExtent l="0" t="0" r="635" b="0"/>
+            <wp:docPr id="150388052" name="Imagem 6"/>
             <wp:cNvGraphicFramePr>
               <a:graphicFrameLocks xmlns:a="http://schemas.openxmlformats.org/drawingml/2006/main" noChangeAspect="1"/>
             </wp:cNvGraphicFramePr>
@@ -7080,7 +6857,7 @@
               <a:graphicData uri="http://schemas.openxmlformats.org/drawingml/2006/picture">
                 <pic:pic xmlns:pic="http://schemas.openxmlformats.org/drawingml/2006/picture">
                   <pic:nvPicPr>
-                    <pic:cNvPr id="0" name="Picture 6"/>
+                    <pic:cNvPr id="0" name="Picture 4"/>
                     <pic:cNvPicPr>
                       <a:picLocks noChangeAspect="1" noChangeArrowheads="1"/>
                     </pic:cNvPicPr>
@@ -7099,9 +6876,9 @@
                     </a:stretch>
                   </pic:blipFill>
                   <pic:spPr bwMode="auto">
-                    <a:xfrm rot="5400000">
+                    <a:xfrm>
                       <a:off x="0" y="0"/>
-                      <a:ext cx="5733415" cy="2647950"/>
+                      <a:ext cx="5733415" cy="3225165"/>
                     </a:xfrm>
                     <a:prstGeom prst="rect">
                       <a:avLst/>
@@ -7122,10 +6899,10 @@
           <w:noProof/>
         </w:rPr>
         <w:drawing>
-          <wp:inline distT="0" distB="0" distL="0" distR="0" wp14:anchorId="6E3D7B5E" wp14:editId="3D4FB2BA">
-            <wp:extent cx="5733415" cy="2647950"/>
-            <wp:effectExtent l="0" t="317" r="317" b="318"/>
-            <wp:docPr id="151943102" name="Imagem 7"/>
+          <wp:inline distT="0" distB="0" distL="0" distR="0" wp14:anchorId="67A41F71" wp14:editId="6EC24937">
+            <wp:extent cx="5733415" cy="3225165"/>
+            <wp:effectExtent l="0" t="0" r="635" b="0"/>
+            <wp:docPr id="282220797" name="Imagem 5"/>
             <wp:cNvGraphicFramePr>
               <a:graphicFrameLocks xmlns:a="http://schemas.openxmlformats.org/drawingml/2006/main" noChangeAspect="1"/>
             </wp:cNvGraphicFramePr>
@@ -7133,7 +6910,7 @@
               <a:graphicData uri="http://schemas.openxmlformats.org/drawingml/2006/picture">
                 <pic:pic xmlns:pic="http://schemas.openxmlformats.org/drawingml/2006/picture">
                   <pic:nvPicPr>
-                    <pic:cNvPr id="0" name="Picture 5"/>
+                    <pic:cNvPr id="0" name="Picture 3"/>
                     <pic:cNvPicPr>
                       <a:picLocks noChangeAspect="1" noChangeArrowheads="1"/>
                     </pic:cNvPicPr>
@@ -7152,9 +6929,9 @@
                     </a:stretch>
                   </pic:blipFill>
                   <pic:spPr bwMode="auto">
-                    <a:xfrm rot="5400000">
+                    <a:xfrm>
                       <a:off x="0" y="0"/>
-                      <a:ext cx="5733415" cy="2647950"/>
+                      <a:ext cx="5733415" cy="3225165"/>
                     </a:xfrm>
                     <a:prstGeom prst="rect">
                       <a:avLst/>
@@ -7176,10 +6953,10 @@
         </w:rPr>
         <w:lastRenderedPageBreak/>
         <w:drawing>
-          <wp:inline distT="0" distB="0" distL="0" distR="0" wp14:anchorId="47B2BE88" wp14:editId="75A45B4E">
-            <wp:extent cx="5733415" cy="2647950"/>
-            <wp:effectExtent l="0" t="317" r="317" b="318"/>
-            <wp:docPr id="2049624321" name="Imagem 6"/>
+          <wp:inline distT="0" distB="0" distL="0" distR="0" wp14:anchorId="1E572239" wp14:editId="5D004775">
+            <wp:extent cx="5733415" cy="3225165"/>
+            <wp:effectExtent l="0" t="0" r="635" b="0"/>
+            <wp:docPr id="120415830" name="Imagem 4"/>
             <wp:cNvGraphicFramePr>
               <a:graphicFrameLocks xmlns:a="http://schemas.openxmlformats.org/drawingml/2006/main" noChangeAspect="1"/>
             </wp:cNvGraphicFramePr>
@@ -7187,7 +6964,7 @@
               <a:graphicData uri="http://schemas.openxmlformats.org/drawingml/2006/picture">
                 <pic:pic xmlns:pic="http://schemas.openxmlformats.org/drawingml/2006/picture">
                   <pic:nvPicPr>
-                    <pic:cNvPr id="0" name="Picture 4"/>
+                    <pic:cNvPr id="0" name="Picture 2"/>
                     <pic:cNvPicPr>
                       <a:picLocks noChangeAspect="1" noChangeArrowheads="1"/>
                     </pic:cNvPicPr>
@@ -7206,9 +6983,9 @@
                     </a:stretch>
                   </pic:blipFill>
                   <pic:spPr bwMode="auto">
-                    <a:xfrm rot="5400000">
+                    <a:xfrm>
                       <a:off x="0" y="0"/>
-                      <a:ext cx="5733415" cy="2647950"/>
+                      <a:ext cx="5733415" cy="3225165"/>
                     </a:xfrm>
                     <a:prstGeom prst="rect">
                       <a:avLst/>
@@ -7229,10 +7006,10 @@
           <w:noProof/>
         </w:rPr>
         <w:drawing>
-          <wp:inline distT="0" distB="0" distL="0" distR="0" wp14:anchorId="2F444B23" wp14:editId="2C1325F8">
-            <wp:extent cx="5733415" cy="2647950"/>
-            <wp:effectExtent l="0" t="317" r="317" b="318"/>
-            <wp:docPr id="759490467" name="Imagem 5"/>
+          <wp:inline distT="0" distB="0" distL="0" distR="0" wp14:anchorId="0FC894F7" wp14:editId="6744FF3A">
+            <wp:extent cx="5733415" cy="3225165"/>
+            <wp:effectExtent l="0" t="0" r="635" b="0"/>
+            <wp:docPr id="685401167" name="Imagem 3"/>
             <wp:cNvGraphicFramePr>
               <a:graphicFrameLocks xmlns:a="http://schemas.openxmlformats.org/drawingml/2006/main" noChangeAspect="1"/>
             </wp:cNvGraphicFramePr>
@@ -7240,7 +7017,7 @@
               <a:graphicData uri="http://schemas.openxmlformats.org/drawingml/2006/picture">
                 <pic:pic xmlns:pic="http://schemas.openxmlformats.org/drawingml/2006/picture">
                   <pic:nvPicPr>
-                    <pic:cNvPr id="0" name="Picture 3"/>
+                    <pic:cNvPr id="0" name="Picture 1"/>
                     <pic:cNvPicPr>
                       <a:picLocks noChangeAspect="1" noChangeArrowheads="1"/>
                     </pic:cNvPicPr>
@@ -7259,9 +7036,9 @@
                     </a:stretch>
                   </pic:blipFill>
                   <pic:spPr bwMode="auto">
-                    <a:xfrm rot="5400000">
+                    <a:xfrm>
                       <a:off x="0" y="0"/>
-                      <a:ext cx="5733415" cy="2647950"/>
+                      <a:ext cx="5733415" cy="3225165"/>
                     </a:xfrm>
                     <a:prstGeom prst="rect">
                       <a:avLst/>
@@ -7277,16 +7054,487 @@
           </wp:inline>
         </w:drawing>
       </w:r>
+    </w:p>
+    <w:p/>
+    <w:p>
+      <w:pPr>
+        <w:pStyle w:val="Ttulo2"/>
+        <w:ind w:left="0"/>
+      </w:pPr>
+      <w:bookmarkStart w:id="17" w:name="_heading=h.xgm67tbi0uvr" w:colFirst="0" w:colLast="0"/>
+      <w:bookmarkEnd w:id="17"/>
+      <w:r>
+        <w:t>3.4 Recursos e Ferramentas</w:t>
+      </w:r>
+    </w:p>
+    <w:p>
+      <w:pPr>
+        <w:rPr>
+          <w:b/>
+          <w:bCs/>
+        </w:rPr>
+      </w:pPr>
+      <w:r>
+        <w:rPr>
+          <w:b/>
+          <w:bCs/>
+        </w:rPr>
+        <w:t>Hardware:</w:t>
+      </w:r>
+    </w:p>
+    <w:p>
+      <w:r>
+        <w:t>Computador e Smartphone.</w:t>
+      </w:r>
+    </w:p>
+    <w:p>
+      <w:pPr>
+        <w:rPr>
+          <w:b/>
+          <w:bCs/>
+        </w:rPr>
+      </w:pPr>
+      <w:r>
+        <w:rPr>
+          <w:b/>
+          <w:bCs/>
+        </w:rPr>
+        <w:t>Software:</w:t>
+      </w:r>
+    </w:p>
+    <w:p>
+      <w:pPr>
+        <w:sectPr>
+          <w:headerReference w:type="default" r:id="rId16"/>
+          <w:pgSz w:w="11909" w:h="16834"/>
+          <w:pgMar w:top="1440" w:right="1440" w:bottom="1440" w:left="1440" w:header="720" w:footer="720" w:gutter="0"/>
+          <w:pgNumType w:start="1"/>
+          <w:cols w:space="720"/>
+        </w:sectPr>
+      </w:pPr>
+    </w:p>
+    <w:p>
+      <w:r>
+        <w:t>Microsoft Word</w:t>
+      </w:r>
+    </w:p>
+    <w:p>
+      <w:proofErr w:type="spellStart"/>
+      <w:r>
+        <w:t>Figma</w:t>
+      </w:r>
+      <w:proofErr w:type="spellEnd"/>
+    </w:p>
+    <w:p>
+      <w:r>
+        <w:t>Draw.io</w:t>
+      </w:r>
+    </w:p>
+    <w:p>
+      <w:r>
+        <w:t>Visual Studio Code</w:t>
+      </w:r>
+    </w:p>
+    <w:p>
+      <w:r>
+        <w:t>Google Chrome</w:t>
+      </w:r>
+    </w:p>
+    <w:p>
+      <w:proofErr w:type="spellStart"/>
+      <w:r>
+        <w:t>Git</w:t>
+      </w:r>
+      <w:proofErr w:type="spellEnd"/>
+      <w:r>
+        <w:t xml:space="preserve"> e GitHub</w:t>
+      </w:r>
+    </w:p>
+    <w:p>
+      <w:r>
+        <w:t>Google Drive</w:t>
+      </w:r>
+    </w:p>
+    <w:p>
+      <w:pPr>
+        <w:jc w:val="left"/>
+        <w:sectPr>
+          <w:type w:val="continuous"/>
+          <w:pgSz w:w="11909" w:h="16834"/>
+          <w:pgMar w:top="1440" w:right="1440" w:bottom="1440" w:left="1440" w:header="720" w:footer="720" w:gutter="0"/>
+          <w:pgNumType w:start="1"/>
+          <w:cols w:num="2" w:space="720"/>
+        </w:sectPr>
+      </w:pPr>
+    </w:p>
+    <w:p>
+      <w:pPr>
+        <w:jc w:val="left"/>
+      </w:pPr>
+    </w:p>
+    <w:p>
+      <w:pPr>
+        <w:pStyle w:val="Ttulo1"/>
+        <w:numPr>
+          <w:ilvl w:val="0"/>
+          <w:numId w:val="1"/>
+        </w:numPr>
+      </w:pPr>
+      <w:bookmarkStart w:id="18" w:name="_heading=h.a8y3bfa3q6dr" w:colFirst="0" w:colLast="0"/>
+      <w:bookmarkEnd w:id="18"/>
+      <w:r>
+        <w:t>Reflexão Socioemocional</w:t>
+      </w:r>
+    </w:p>
+    <w:p>
+      <w:pPr>
+        <w:pStyle w:val="Ttulo2"/>
+        <w:ind w:firstLine="142"/>
+      </w:pPr>
+      <w:bookmarkStart w:id="19" w:name="_heading=h.ndjid1pp2ys" w:colFirst="0" w:colLast="0"/>
+      <w:bookmarkEnd w:id="19"/>
+      <w:r>
+        <w:t>4.1 Autoavaliação da Equipe</w:t>
+      </w:r>
+    </w:p>
+    <w:p>
+      <w:pPr>
+        <w:pStyle w:val="Ttulo2"/>
+        <w:ind w:firstLine="142"/>
+        <w:rPr>
+          <w:b w:val="0"/>
+          <w:bCs w:val="0"/>
+          <w:sz w:val="22"/>
+          <w:szCs w:val="22"/>
+        </w:rPr>
+      </w:pPr>
+      <w:bookmarkStart w:id="20" w:name="_heading=h.9gkf758hs31l" w:colFirst="0" w:colLast="0"/>
+      <w:bookmarkEnd w:id="20"/>
+      <w:r>
+        <w:rPr>
+          <w:b w:val="0"/>
+          <w:bCs w:val="0"/>
+          <w:sz w:val="22"/>
+          <w:szCs w:val="22"/>
+        </w:rPr>
+        <w:t>Como lidaram com feedbacks negativos?</w:t>
+      </w:r>
+    </w:p>
+    <w:p>
+      <w:r>
+        <w:t xml:space="preserve">Neutros, uma pequena preocupação no </w:t>
+      </w:r>
+      <w:r>
+        <w:t>início,</w:t>
+      </w:r>
+      <w:r>
+        <w:t xml:space="preserve"> mas nos organizamos para fazer uma etapa de cada vez.</w:t>
+      </w:r>
+    </w:p>
+    <w:p>
+      <w:pPr>
+        <w:pStyle w:val="Ttulo2"/>
+        <w:ind w:firstLine="142"/>
+        <w:rPr>
+          <w:b w:val="0"/>
+          <w:bCs w:val="0"/>
+          <w:sz w:val="22"/>
+          <w:szCs w:val="22"/>
+        </w:rPr>
+      </w:pPr>
+      <w:bookmarkStart w:id="21" w:name="_heading=h.ge3v0w1x3oqp" w:colFirst="0" w:colLast="0"/>
+      <w:bookmarkEnd w:id="21"/>
+      <w:r>
+        <w:rPr>
+          <w:b w:val="0"/>
+          <w:bCs w:val="0"/>
+          <w:sz w:val="22"/>
+          <w:szCs w:val="22"/>
+        </w:rPr>
+        <w:t>Quem buscou conhecimento extra para resolver um problema técnico?</w:t>
+      </w:r>
+    </w:p>
+    <w:p>
+      <w:r>
+        <w:t>Todos, assim que surgia algum impasse ou erro cada um apresentava uma forma de solução.</w:t>
+      </w:r>
+    </w:p>
+    <w:p>
+      <w:pPr>
+        <w:pStyle w:val="Ttulo2"/>
+        <w:ind w:firstLine="142"/>
+        <w:rPr>
+          <w:b w:val="0"/>
+          <w:bCs w:val="0"/>
+          <w:sz w:val="22"/>
+          <w:szCs w:val="22"/>
+        </w:rPr>
+      </w:pPr>
+      <w:bookmarkStart w:id="22" w:name="_heading=h.ffqdjd8rvo2v" w:colFirst="0" w:colLast="0"/>
+      <w:bookmarkEnd w:id="22"/>
+      <w:r>
+        <w:rPr>
+          <w:b w:val="0"/>
+          <w:bCs w:val="0"/>
+          <w:sz w:val="22"/>
+          <w:szCs w:val="22"/>
+        </w:rPr>
+        <w:t>Inteligência Interpessoal: Como gerenciaram o tempo e o temperamento do grupo?</w:t>
+      </w:r>
+    </w:p>
+    <w:p>
+      <w:r>
+        <w:t>Temperamento do grupo é neutro, quando um aparecia com uma nova ideia outra pessoa completava e fomos seguindo esse ritmo, sempre colocando as ideias na mesa. Gerenciamento de tempo em geral foi tranquilo, temos um grupo para comunicações deste projeto então nossa comunicação estava em dia, sobre ideias, alterações...</w:t>
+      </w:r>
+    </w:p>
+    <w:p/>
+    <w:p>
+      <w:pPr>
+        <w:pStyle w:val="Ttulo2"/>
+        <w:ind w:firstLine="142"/>
+        <w:rPr>
+          <w:b w:val="0"/>
+          <w:bCs w:val="0"/>
+          <w:sz w:val="22"/>
+          <w:szCs w:val="22"/>
+        </w:rPr>
+      </w:pPr>
+    </w:p>
+    <w:p>
+      <w:pPr>
+        <w:pStyle w:val="Ttulo2"/>
+        <w:ind w:firstLine="142"/>
+      </w:pPr>
+      <w:bookmarkStart w:id="23" w:name="_heading=h.930z38cf44x6" w:colFirst="0" w:colLast="0"/>
+      <w:bookmarkEnd w:id="23"/>
+      <w:r>
+        <w:t>4.2 Relato de Experiência na Comunidade</w:t>
+      </w:r>
+    </w:p>
+    <w:p>
+      <w:r>
+        <w:t>A visita ao Studio de Pilates permitiu uma compreensão profunda de que o desenvolvimento de software vai além da codificação; trata-se de resolver problemas humanos reais. Ao observar a proprietária gerindo sozinha todas as pontas do negócio, percebemos que a simplicidade é o requisito mais valioso. A transição da sala de aula para o ambiente real nos mostrou que uma solução tecnológica, por mais simples que seja (como a separação de contas e a digitalização da agenda), pode ser o diferencial para a sobrevivência e crescimento de um microempreendedor. Essa experiência reforçou nosso papel como agentes de transformação digital na comunidade local.</w:t>
+      </w:r>
+      <w:r>
+        <w:br w:type="page"/>
+      </w:r>
+    </w:p>
+    <w:p>
+      <w:pPr>
+        <w:pStyle w:val="Ttulo1"/>
+        <w:numPr>
+          <w:ilvl w:val="0"/>
+          <w:numId w:val="1"/>
+        </w:numPr>
+      </w:pPr>
+      <w:bookmarkStart w:id="24" w:name="_heading=h.wr6menp38s79" w:colFirst="0" w:colLast="0"/>
+      <w:bookmarkEnd w:id="24"/>
+      <w:r>
+        <w:lastRenderedPageBreak/>
+        <w:t>Considerações Finais</w:t>
+      </w:r>
+    </w:p>
+    <w:p/>
+    <w:p>
+      <w:pPr>
+        <w:rPr>
+          <w:b/>
+          <w:bCs/>
+        </w:rPr>
+      </w:pPr>
+      <w:r>
+        <w:rPr>
+          <w:b/>
+          <w:bCs/>
+        </w:rPr>
+        <w:t>Conclusão: Concluir o trabalho e destacar aprendizados</w:t>
+      </w:r>
+    </w:p>
+    <w:p/>
+    <w:p>
+      <w:r>
+        <w:t>Documentação concluída, ideia inicial pronta para o projeto ser desenvolvido. Nosso principal objetivo para o desenvolvimento desse projeto foi criar uma gestão voltada para o controle de alunos, horários e pagamentos. Temos nosso fluxograma e diagrama de caso de uso qu</w:t>
+      </w:r>
+      <w:r>
+        <w:t>e</w:t>
+      </w:r>
+      <w:r>
+        <w:t xml:space="preserve"> mostram como o sistema deve funcionar, com o uso exclusivo da proprietária, facilitando a organização da própria para estar em dia com os pagamentos e presença nas aulas agendadas. Facilidad</w:t>
+      </w:r>
+      <w:r>
+        <w:t>e</w:t>
+      </w:r>
+      <w:r>
+        <w:t xml:space="preserve"> para a administração de aulas, contando com o cadastro e edições para os alunos, horários agendados e os que estão livres (permitindo que ela tenha controle total da sua agenda), alunos com pagamento no prazo e alunos que passaram do prazo. </w:t>
+      </w:r>
+    </w:p>
+    <w:p/>
+    <w:p/>
+    <w:p>
+      <w:pPr>
+        <w:rPr>
+          <w:b/>
+          <w:bCs/>
+        </w:rPr>
+      </w:pPr>
+      <w:r>
+        <w:rPr>
+          <w:b/>
+          <w:bCs/>
+        </w:rPr>
+        <w:t>Contribuições Individuais: Descrever as contribuições individuais de cada membro da equipe</w:t>
+      </w:r>
+    </w:p>
+    <w:p/>
+    <w:p>
+      <w:r>
+        <w:rPr>
+          <w:b/>
+          <w:bCs/>
+        </w:rPr>
+        <w:t>Contribuições Individuais:</w:t>
+      </w:r>
+      <w:r>
+        <w:t xml:space="preserve"> Tiago ficou responsável pela documentação e contato direto com a proprietária do estúdio; Alessandro ficou responsável pelo fluxograma e GitHub; Gustavo ficou responsável com o nosso </w:t>
+      </w:r>
+      <w:r>
+        <w:t>P</w:t>
+      </w:r>
+      <w:r>
+        <w:t>lanner e colaborou com o GitHub; Gabriel ficou responsável com a apresentação final do projeto e colaborou com o diagrama de caso de uso; Helena ficou responsáve</w:t>
+      </w:r>
+      <w:r>
+        <w:t>l</w:t>
+      </w:r>
+      <w:r>
+        <w:t xml:space="preserve"> pelo diagrama de caso de uso e colaborou com a documentação. Em geral tivemos a colaboração de todos os membros em diversas tarefas, conseguindo encaixar a ideia de todos em nosso projeto.</w:t>
+      </w:r>
+    </w:p>
+    <w:p/>
+    <w:p>
+      <w:pPr>
+        <w:pStyle w:val="Ttulo1"/>
+      </w:pPr>
+      <w:bookmarkStart w:id="25" w:name="_heading=h.nqm818qgse8j" w:colFirst="0" w:colLast="0"/>
+      <w:bookmarkEnd w:id="25"/>
+      <w:r>
+        <w:t>Referências</w:t>
+      </w:r>
+    </w:p>
+    <w:p>
+      <w:r>
+        <w:t xml:space="preserve">SOMMERVILLE, Ian. Engenharia de Software. 10. ed. São Paulo: Pearson </w:t>
+      </w:r>
+      <w:proofErr w:type="spellStart"/>
+      <w:r>
+        <w:t>Education</w:t>
+      </w:r>
+      <w:proofErr w:type="spellEnd"/>
+      <w:r>
+        <w:t xml:space="preserve"> do Brasil, 2018. </w:t>
+      </w:r>
+    </w:p>
+    <w:p>
+      <w:r>
+        <w:t xml:space="preserve">PRESSMAN, Roger S. Engenharia de Software: uma abordagem profissional. 8. ed. Porto Alegre: AMGH, 2016. </w:t>
+      </w:r>
+    </w:p>
+    <w:p>
+      <w:r>
+        <w:t>VALENTE, Marco Tulio. Engenharia de Software Moderna. 1. ed. 2020 (E-book).</w:t>
+      </w:r>
+    </w:p>
+    <w:p/>
+    <w:p/>
+    <w:p>
+      <w:pPr>
+        <w:pStyle w:val="Ttulo1"/>
+        <w:ind w:left="710" w:firstLine="0"/>
+      </w:pPr>
+      <w:bookmarkStart w:id="26" w:name="_heading=h.lsdn64ez1zwi" w:colFirst="0" w:colLast="0"/>
+      <w:bookmarkEnd w:id="26"/>
+      <w:r>
+        <w:t>Anexo I - Diário de bordo</w:t>
+      </w:r>
+    </w:p>
+    <w:p>
+      <w:r>
+        <w:rPr>
+          <w:b/>
+          <w:bCs/>
+        </w:rPr>
+        <w:t>Virtual:</w:t>
+      </w:r>
+      <w:r>
+        <w:t xml:space="preserve"> Feito pelo grupo e inserido em uma pasta chamada Diário de Bordo dentro do repositório.</w:t>
+      </w:r>
+    </w:p>
+    <w:p>
+      <w:r>
+        <w:t xml:space="preserve">Semana 1-2: Definição do grupo e escolha do parceiro (Studio de Pilates). </w:t>
+      </w:r>
+    </w:p>
+    <w:p>
+      <w:r>
+        <w:t xml:space="preserve">Semana 3-4: Visita técnica in loco, entrevista com a proprietária e aplicação do 5W2H. Semana 5-6: Análise de dados, separação de requisitos funcionais e não funcionais. </w:t>
+      </w:r>
+    </w:p>
+    <w:p>
+      <w:r>
+        <w:t xml:space="preserve">Semana 7-8: Modelagem técnica, criação de fluxogramas e dicionário de dados. </w:t>
+      </w:r>
+    </w:p>
+    <w:p>
+      <w:r>
+        <w:lastRenderedPageBreak/>
+        <w:t>Semana 9-10: Desenvolvimento do protótipo de baixa fidelidade e finalização da documentação.</w:t>
+      </w:r>
+    </w:p>
+    <w:p>
+      <w:pPr>
+        <w:pStyle w:val="Ttulo1"/>
+        <w:ind w:left="720" w:firstLine="0"/>
+      </w:pPr>
+      <w:bookmarkStart w:id="27" w:name="_heading=h.l3j0u9oay8ct" w:colFirst="0" w:colLast="0"/>
+      <w:bookmarkEnd w:id="27"/>
+      <w:r>
+        <w:t>Anexo II – Cronograma efetivo</w:t>
+      </w:r>
+    </w:p>
+    <w:p>
+      <w:r>
+        <w:t xml:space="preserve">O cronograma efetivo do projeto foi realizado em etapas que foram dos requisitos até a finalização da documentação. Inicialmente foram identificadas as necessidades do sistema e definidas </w:t>
+      </w:r>
+      <w:r>
+        <w:t>suas funcionalidades</w:t>
+      </w:r>
+      <w:r>
+        <w:t>. Em seguida incluindo o fluxograma. Por fim, foi concluído a documentação do projeto e a revisão para a entrega final.</w:t>
+      </w:r>
+    </w:p>
+    <w:p>
+      <w:pPr>
+        <w:pStyle w:val="Ttulo1"/>
+        <w:ind w:left="720" w:firstLine="0"/>
+      </w:pPr>
+      <w:bookmarkStart w:id="28" w:name="_heading=h.3ykr8cde8xx5" w:colFirst="0" w:colLast="0"/>
+      <w:bookmarkEnd w:id="28"/>
+      <w:r>
+        <w:lastRenderedPageBreak/>
+        <w:t>Anexo III – Evidências</w:t>
+      </w:r>
+    </w:p>
+    <w:p>
       <w:r>
         <w:rPr>
           <w:noProof/>
         </w:rPr>
         <w:lastRenderedPageBreak/>
         <w:drawing>
-          <wp:inline distT="0" distB="0" distL="0" distR="0" wp14:anchorId="6A034E7C" wp14:editId="55940F13">
+          <wp:inline distT="0" distB="0" distL="0" distR="0" wp14:anchorId="2277EFF6" wp14:editId="358858EC">
             <wp:extent cx="5733415" cy="2647950"/>
             <wp:effectExtent l="0" t="317" r="317" b="318"/>
-            <wp:docPr id="1401230384" name="Imagem 4"/>
+            <wp:docPr id="215174488" name="Imagem 8"/>
             <wp:cNvGraphicFramePr>
               <a:graphicFrameLocks xmlns:a="http://schemas.openxmlformats.org/drawingml/2006/main" noChangeAspect="1"/>
             </wp:cNvGraphicFramePr>
@@ -7294,60 +7542,7 @@
               <a:graphicData uri="http://schemas.openxmlformats.org/drawingml/2006/picture">
                 <pic:pic xmlns:pic="http://schemas.openxmlformats.org/drawingml/2006/picture">
                   <pic:nvPicPr>
-                    <pic:cNvPr id="0" name="Picture 2"/>
-                    <pic:cNvPicPr>
-                      <a:picLocks noChangeAspect="1" noChangeArrowheads="1"/>
-                    </pic:cNvPicPr>
-                  </pic:nvPicPr>
-                  <pic:blipFill>
-                    <a:blip r:embed="rId16" cstate="print">
-                      <a:extLst>
-                        <a:ext uri="{28A0092B-C50C-407E-A947-70E740481C1C}">
-                          <a14:useLocalDpi xmlns:a14="http://schemas.microsoft.com/office/drawing/2010/main" val="0"/>
-                        </a:ext>
-                      </a:extLst>
-                    </a:blip>
-                    <a:srcRect/>
-                    <a:stretch>
-                      <a:fillRect/>
-                    </a:stretch>
-                  </pic:blipFill>
-                  <pic:spPr bwMode="auto">
-                    <a:xfrm rot="5400000">
-                      <a:off x="0" y="0"/>
-                      <a:ext cx="5733415" cy="2647950"/>
-                    </a:xfrm>
-                    <a:prstGeom prst="rect">
-                      <a:avLst/>
-                    </a:prstGeom>
-                    <a:noFill/>
-                    <a:ln>
-                      <a:noFill/>
-                    </a:ln>
-                  </pic:spPr>
-                </pic:pic>
-              </a:graphicData>
-            </a:graphic>
-          </wp:inline>
-        </w:drawing>
-      </w:r>
-      <w:r>
-        <w:rPr>
-          <w:noProof/>
-        </w:rPr>
-        <w:drawing>
-          <wp:inline distT="0" distB="0" distL="0" distR="0" wp14:anchorId="1BE6E3E9" wp14:editId="5C7026F9">
-            <wp:extent cx="5733415" cy="2647950"/>
-            <wp:effectExtent l="0" t="317" r="317" b="318"/>
-            <wp:docPr id="239960292" name="Imagem 3"/>
-            <wp:cNvGraphicFramePr>
-              <a:graphicFrameLocks xmlns:a="http://schemas.openxmlformats.org/drawingml/2006/main" noChangeAspect="1"/>
-            </wp:cNvGraphicFramePr>
-            <a:graphic xmlns:a="http://schemas.openxmlformats.org/drawingml/2006/main">
-              <a:graphicData uri="http://schemas.openxmlformats.org/drawingml/2006/picture">
-                <pic:pic xmlns:pic="http://schemas.openxmlformats.org/drawingml/2006/picture">
-                  <pic:nvPicPr>
-                    <pic:cNvPr id="0" name="Picture 1"/>
+                    <pic:cNvPr id="0" name="Picture 6"/>
                     <pic:cNvPicPr>
                       <a:picLocks noChangeAspect="1" noChangeArrowheads="1"/>
                     </pic:cNvPicPr>
@@ -7384,9 +7579,276 @@
           </wp:inline>
         </w:drawing>
       </w:r>
+      <w:r>
+        <w:rPr>
+          <w:noProof/>
+        </w:rPr>
+        <w:drawing>
+          <wp:inline distT="0" distB="0" distL="0" distR="0" wp14:anchorId="6E3D7B5E" wp14:editId="3D4FB2BA">
+            <wp:extent cx="5733415" cy="2647950"/>
+            <wp:effectExtent l="0" t="317" r="317" b="318"/>
+            <wp:docPr id="151943102" name="Imagem 7"/>
+            <wp:cNvGraphicFramePr>
+              <a:graphicFrameLocks xmlns:a="http://schemas.openxmlformats.org/drawingml/2006/main" noChangeAspect="1"/>
+            </wp:cNvGraphicFramePr>
+            <a:graphic xmlns:a="http://schemas.openxmlformats.org/drawingml/2006/main">
+              <a:graphicData uri="http://schemas.openxmlformats.org/drawingml/2006/picture">
+                <pic:pic xmlns:pic="http://schemas.openxmlformats.org/drawingml/2006/picture">
+                  <pic:nvPicPr>
+                    <pic:cNvPr id="0" name="Picture 5"/>
+                    <pic:cNvPicPr>
+                      <a:picLocks noChangeAspect="1" noChangeArrowheads="1"/>
+                    </pic:cNvPicPr>
+                  </pic:nvPicPr>
+                  <pic:blipFill>
+                    <a:blip r:embed="rId18" cstate="print">
+                      <a:extLst>
+                        <a:ext uri="{28A0092B-C50C-407E-A947-70E740481C1C}">
+                          <a14:useLocalDpi xmlns:a14="http://schemas.microsoft.com/office/drawing/2010/main" val="0"/>
+                        </a:ext>
+                      </a:extLst>
+                    </a:blip>
+                    <a:srcRect/>
+                    <a:stretch>
+                      <a:fillRect/>
+                    </a:stretch>
+                  </pic:blipFill>
+                  <pic:spPr bwMode="auto">
+                    <a:xfrm rot="5400000">
+                      <a:off x="0" y="0"/>
+                      <a:ext cx="5733415" cy="2647950"/>
+                    </a:xfrm>
+                    <a:prstGeom prst="rect">
+                      <a:avLst/>
+                    </a:prstGeom>
+                    <a:noFill/>
+                    <a:ln>
+                      <a:noFill/>
+                    </a:ln>
+                  </pic:spPr>
+                </pic:pic>
+              </a:graphicData>
+            </a:graphic>
+          </wp:inline>
+        </w:drawing>
+      </w:r>
+      <w:r>
+        <w:rPr>
+          <w:noProof/>
+        </w:rPr>
+        <w:lastRenderedPageBreak/>
+        <w:drawing>
+          <wp:inline distT="0" distB="0" distL="0" distR="0" wp14:anchorId="47B2BE88" wp14:editId="75A45B4E">
+            <wp:extent cx="5733415" cy="2647950"/>
+            <wp:effectExtent l="0" t="317" r="317" b="318"/>
+            <wp:docPr id="2049624321" name="Imagem 6"/>
+            <wp:cNvGraphicFramePr>
+              <a:graphicFrameLocks xmlns:a="http://schemas.openxmlformats.org/drawingml/2006/main" noChangeAspect="1"/>
+            </wp:cNvGraphicFramePr>
+            <a:graphic xmlns:a="http://schemas.openxmlformats.org/drawingml/2006/main">
+              <a:graphicData uri="http://schemas.openxmlformats.org/drawingml/2006/picture">
+                <pic:pic xmlns:pic="http://schemas.openxmlformats.org/drawingml/2006/picture">
+                  <pic:nvPicPr>
+                    <pic:cNvPr id="0" name="Picture 4"/>
+                    <pic:cNvPicPr>
+                      <a:picLocks noChangeAspect="1" noChangeArrowheads="1"/>
+                    </pic:cNvPicPr>
+                  </pic:nvPicPr>
+                  <pic:blipFill>
+                    <a:blip r:embed="rId19" cstate="print">
+                      <a:extLst>
+                        <a:ext uri="{28A0092B-C50C-407E-A947-70E740481C1C}">
+                          <a14:useLocalDpi xmlns:a14="http://schemas.microsoft.com/office/drawing/2010/main" val="0"/>
+                        </a:ext>
+                      </a:extLst>
+                    </a:blip>
+                    <a:srcRect/>
+                    <a:stretch>
+                      <a:fillRect/>
+                    </a:stretch>
+                  </pic:blipFill>
+                  <pic:spPr bwMode="auto">
+                    <a:xfrm rot="5400000">
+                      <a:off x="0" y="0"/>
+                      <a:ext cx="5733415" cy="2647950"/>
+                    </a:xfrm>
+                    <a:prstGeom prst="rect">
+                      <a:avLst/>
+                    </a:prstGeom>
+                    <a:noFill/>
+                    <a:ln>
+                      <a:noFill/>
+                    </a:ln>
+                  </pic:spPr>
+                </pic:pic>
+              </a:graphicData>
+            </a:graphic>
+          </wp:inline>
+        </w:drawing>
+      </w:r>
+      <w:r>
+        <w:rPr>
+          <w:noProof/>
+        </w:rPr>
+        <w:drawing>
+          <wp:inline distT="0" distB="0" distL="0" distR="0" wp14:anchorId="2F444B23" wp14:editId="2C1325F8">
+            <wp:extent cx="5733415" cy="2647950"/>
+            <wp:effectExtent l="0" t="317" r="317" b="318"/>
+            <wp:docPr id="759490467" name="Imagem 5"/>
+            <wp:cNvGraphicFramePr>
+              <a:graphicFrameLocks xmlns:a="http://schemas.openxmlformats.org/drawingml/2006/main" noChangeAspect="1"/>
+            </wp:cNvGraphicFramePr>
+            <a:graphic xmlns:a="http://schemas.openxmlformats.org/drawingml/2006/main">
+              <a:graphicData uri="http://schemas.openxmlformats.org/drawingml/2006/picture">
+                <pic:pic xmlns:pic="http://schemas.openxmlformats.org/drawingml/2006/picture">
+                  <pic:nvPicPr>
+                    <pic:cNvPr id="0" name="Picture 3"/>
+                    <pic:cNvPicPr>
+                      <a:picLocks noChangeAspect="1" noChangeArrowheads="1"/>
+                    </pic:cNvPicPr>
+                  </pic:nvPicPr>
+                  <pic:blipFill>
+                    <a:blip r:embed="rId20" cstate="print">
+                      <a:extLst>
+                        <a:ext uri="{28A0092B-C50C-407E-A947-70E740481C1C}">
+                          <a14:useLocalDpi xmlns:a14="http://schemas.microsoft.com/office/drawing/2010/main" val="0"/>
+                        </a:ext>
+                      </a:extLst>
+                    </a:blip>
+                    <a:srcRect/>
+                    <a:stretch>
+                      <a:fillRect/>
+                    </a:stretch>
+                  </pic:blipFill>
+                  <pic:spPr bwMode="auto">
+                    <a:xfrm rot="5400000">
+                      <a:off x="0" y="0"/>
+                      <a:ext cx="5733415" cy="2647950"/>
+                    </a:xfrm>
+                    <a:prstGeom prst="rect">
+                      <a:avLst/>
+                    </a:prstGeom>
+                    <a:noFill/>
+                    <a:ln>
+                      <a:noFill/>
+                    </a:ln>
+                  </pic:spPr>
+                </pic:pic>
+              </a:graphicData>
+            </a:graphic>
+          </wp:inline>
+        </w:drawing>
+      </w:r>
+      <w:r>
+        <w:rPr>
+          <w:noProof/>
+        </w:rPr>
+        <w:lastRenderedPageBreak/>
+        <w:drawing>
+          <wp:inline distT="0" distB="0" distL="0" distR="0" wp14:anchorId="6A034E7C" wp14:editId="55940F13">
+            <wp:extent cx="5733415" cy="2647950"/>
+            <wp:effectExtent l="0" t="317" r="317" b="318"/>
+            <wp:docPr id="1401230384" name="Imagem 4"/>
+            <wp:cNvGraphicFramePr>
+              <a:graphicFrameLocks xmlns:a="http://schemas.openxmlformats.org/drawingml/2006/main" noChangeAspect="1"/>
+            </wp:cNvGraphicFramePr>
+            <a:graphic xmlns:a="http://schemas.openxmlformats.org/drawingml/2006/main">
+              <a:graphicData uri="http://schemas.openxmlformats.org/drawingml/2006/picture">
+                <pic:pic xmlns:pic="http://schemas.openxmlformats.org/drawingml/2006/picture">
+                  <pic:nvPicPr>
+                    <pic:cNvPr id="0" name="Picture 2"/>
+                    <pic:cNvPicPr>
+                      <a:picLocks noChangeAspect="1" noChangeArrowheads="1"/>
+                    </pic:cNvPicPr>
+                  </pic:nvPicPr>
+                  <pic:blipFill>
+                    <a:blip r:embed="rId21" cstate="print">
+                      <a:extLst>
+                        <a:ext uri="{28A0092B-C50C-407E-A947-70E740481C1C}">
+                          <a14:useLocalDpi xmlns:a14="http://schemas.microsoft.com/office/drawing/2010/main" val="0"/>
+                        </a:ext>
+                      </a:extLst>
+                    </a:blip>
+                    <a:srcRect/>
+                    <a:stretch>
+                      <a:fillRect/>
+                    </a:stretch>
+                  </pic:blipFill>
+                  <pic:spPr bwMode="auto">
+                    <a:xfrm rot="5400000">
+                      <a:off x="0" y="0"/>
+                      <a:ext cx="5733415" cy="2647950"/>
+                    </a:xfrm>
+                    <a:prstGeom prst="rect">
+                      <a:avLst/>
+                    </a:prstGeom>
+                    <a:noFill/>
+                    <a:ln>
+                      <a:noFill/>
+                    </a:ln>
+                  </pic:spPr>
+                </pic:pic>
+              </a:graphicData>
+            </a:graphic>
+          </wp:inline>
+        </w:drawing>
+      </w:r>
+      <w:r>
+        <w:rPr>
+          <w:noProof/>
+        </w:rPr>
+        <w:drawing>
+          <wp:inline distT="0" distB="0" distL="0" distR="0" wp14:anchorId="1BE6E3E9" wp14:editId="5C7026F9">
+            <wp:extent cx="5733415" cy="2647950"/>
+            <wp:effectExtent l="0" t="317" r="317" b="318"/>
+            <wp:docPr id="239960292" name="Imagem 3"/>
+            <wp:cNvGraphicFramePr>
+              <a:graphicFrameLocks xmlns:a="http://schemas.openxmlformats.org/drawingml/2006/main" noChangeAspect="1"/>
+            </wp:cNvGraphicFramePr>
+            <a:graphic xmlns:a="http://schemas.openxmlformats.org/drawingml/2006/main">
+              <a:graphicData uri="http://schemas.openxmlformats.org/drawingml/2006/picture">
+                <pic:pic xmlns:pic="http://schemas.openxmlformats.org/drawingml/2006/picture">
+                  <pic:nvPicPr>
+                    <pic:cNvPr id="0" name="Picture 1"/>
+                    <pic:cNvPicPr>
+                      <a:picLocks noChangeAspect="1" noChangeArrowheads="1"/>
+                    </pic:cNvPicPr>
+                  </pic:nvPicPr>
+                  <pic:blipFill>
+                    <a:blip r:embed="rId22" cstate="print">
+                      <a:extLst>
+                        <a:ext uri="{28A0092B-C50C-407E-A947-70E740481C1C}">
+                          <a14:useLocalDpi xmlns:a14="http://schemas.microsoft.com/office/drawing/2010/main" val="0"/>
+                        </a:ext>
+                      </a:extLst>
+                    </a:blip>
+                    <a:srcRect/>
+                    <a:stretch>
+                      <a:fillRect/>
+                    </a:stretch>
+                  </pic:blipFill>
+                  <pic:spPr bwMode="auto">
+                    <a:xfrm rot="5400000">
+                      <a:off x="0" y="0"/>
+                      <a:ext cx="5733415" cy="2647950"/>
+                    </a:xfrm>
+                    <a:prstGeom prst="rect">
+                      <a:avLst/>
+                    </a:prstGeom>
+                    <a:noFill/>
+                    <a:ln>
+                      <a:noFill/>
+                    </a:ln>
+                  </pic:spPr>
+                </pic:pic>
+              </a:graphicData>
+            </a:graphic>
+          </wp:inline>
+        </w:drawing>
+      </w:r>
     </w:p>
     <w:sectPr>
-      <w:headerReference w:type="default" r:id="rId18"/>
+      <w:type w:val="continuous"/>
       <w:pgSz w:w="11909" w:h="16834"/>
       <w:pgMar w:top="1440" w:right="1440" w:bottom="1440" w:left="1440" w:header="720" w:footer="720" w:gutter="0"/>
       <w:pgNumType w:start="1"/>
@@ -7397,7 +7859,7 @@
 </file>
 
 <file path=word/endnotes.xml><?xml version="1.0" encoding="utf-8"?>
-<w:endnotes xmlns:wpc="http://schemas.microsoft.com/office/word/2010/wordprocessingCanvas" xmlns:cx="http://schemas.microsoft.com/office/drawing/2014/chartex" xmlns:cx1="http://schemas.microsoft.com/office/drawing/2015/9/8/chartex" xmlns:cx2="http://schemas.microsoft.com/office/drawing/2015/10/21/chartex" xmlns:cx3="http://schemas.microsoft.com/office/drawing/2016/5/9/chartex" xmlns:cx4="http://schemas.microsoft.com/office/drawing/2016/5/10/chartex" xmlns:cx5="http://schemas.microsoft.com/office/drawing/2016/5/11/chartex" xmlns:cx6="http://schemas.microsoft.com/office/drawing/2016/5/12/chartex" xmlns:cx7="http://schemas.microsoft.com/office/drawing/2016/5/13/chartex" xmlns:cx8="http://schemas.microsoft.com/office/drawing/2016/5/14/chartex" xmlns:mc="http://schemas.openxmlformats.org/markup-compatibility/2006" xmlns:aink="http://schemas.microsoft.com/office/drawing/2016/ink" xmlns:am3d="http://schemas.microsoft.com/office/drawing/2017/model3d" xmlns:o="urn:schemas-microsoft-com:office:office" xmlns:r="http://schemas.openxmlformats.org/officeDocument/2006/relationships" xmlns:m="http://schemas.openxmlformats.org/officeDocument/2006/math" xmlns:v="urn:schemas-microsoft-com:vml" xmlns:wp14="http://schemas.microsoft.com/office/word/2010/wordprocessingDrawing" xmlns:wp="http://schemas.openxmlformats.org/drawingml/2006/wordprocessingDrawing" xmlns:w10="urn:schemas-microsoft-com:office:word" xmlns:w="http://schemas.openxmlformats.org/wordprocessingml/2006/main" xmlns:w14="http://schemas.microsoft.com/office/word/2010/wordml" xmlns:w15="http://schemas.microsoft.com/office/word/2012/wordml" xmlns:w16cex="http://schemas.microsoft.com/office/word/2018/wordml/cex" xmlns:w16cid="http://schemas.microsoft.com/office/word/2016/wordml/cid" xmlns:w16="http://schemas.microsoft.com/office/word/2018/wordml" xmlns:w16sdtdh="http://schemas.microsoft.com/office/word/2020/wordml/sdtdatahash" xmlns:w16se="http://schemas.microsoft.com/office/word/2015/wordml/symex" xmlns:wpg="http://schemas.microsoft.com/office/word/2010/wordprocessingGroup" xmlns:wpi="http://schemas.microsoft.com/office/word/2010/wordprocessingInk" xmlns:wne="http://schemas.microsoft.com/office/word/2006/wordml" xmlns:wps="http://schemas.microsoft.com/office/word/2010/wordprocessingShape" mc:Ignorable="w14 w15 w16se w16cid w16 w16cex w16sdtdh wp14">
+<w:endnotes xmlns:wpc="http://schemas.microsoft.com/office/word/2010/wordprocessingCanvas" xmlns:cx="http://schemas.microsoft.com/office/drawing/2014/chartex" xmlns:cx1="http://schemas.microsoft.com/office/drawing/2015/9/8/chartex" xmlns:cx2="http://schemas.microsoft.com/office/drawing/2015/10/21/chartex" xmlns:cx3="http://schemas.microsoft.com/office/drawing/2016/5/9/chartex" xmlns:cx4="http://schemas.microsoft.com/office/drawing/2016/5/10/chartex" xmlns:cx5="http://schemas.microsoft.com/office/drawing/2016/5/11/chartex" xmlns:cx6="http://schemas.microsoft.com/office/drawing/2016/5/12/chartex" xmlns:cx7="http://schemas.microsoft.com/office/drawing/2016/5/13/chartex" xmlns:cx8="http://schemas.microsoft.com/office/drawing/2016/5/14/chartex" xmlns:mc="http://schemas.openxmlformats.org/markup-compatibility/2006" xmlns:aink="http://schemas.microsoft.com/office/drawing/2016/ink" xmlns:am3d="http://schemas.microsoft.com/office/drawing/2017/model3d" xmlns:o="urn:schemas-microsoft-com:office:office" xmlns:oel="http://schemas.microsoft.com/office/2019/extlst" xmlns:r="http://schemas.openxmlformats.org/officeDocument/2006/relationships" xmlns:m="http://schemas.openxmlformats.org/officeDocument/2006/math" xmlns:v="urn:schemas-microsoft-com:vml" xmlns:wp14="http://schemas.microsoft.com/office/word/2010/wordprocessingDrawing" xmlns:wp="http://schemas.openxmlformats.org/drawingml/2006/wordprocessingDrawing" xmlns:w10="urn:schemas-microsoft-com:office:word" xmlns:w="http://schemas.openxmlformats.org/wordprocessingml/2006/main" xmlns:w14="http://schemas.microsoft.com/office/word/2010/wordml" xmlns:w15="http://schemas.microsoft.com/office/word/2012/wordml" xmlns:w16cex="http://schemas.microsoft.com/office/word/2018/wordml/cex" xmlns:w16cid="http://schemas.microsoft.com/office/word/2016/wordml/cid" xmlns:w16="http://schemas.microsoft.com/office/word/2018/wordml" xmlns:w16du="http://schemas.microsoft.com/office/word/2023/wordml/word16du" xmlns:w16sdtdh="http://schemas.microsoft.com/office/word/2020/wordml/sdtdatahash" xmlns:w16sdtfl="http://schemas.microsoft.com/office/word/2024/wordml/sdtformatlock" xmlns:w16se="http://schemas.microsoft.com/office/word/2015/wordml/symex" xmlns:wpg="http://schemas.microsoft.com/office/word/2010/wordprocessingGroup" xmlns:wpi="http://schemas.microsoft.com/office/word/2010/wordprocessingInk" xmlns:wne="http://schemas.microsoft.com/office/word/2006/wordml" xmlns:wps="http://schemas.microsoft.com/office/word/2010/wordprocessingShape" mc:Ignorable="w14 w15 w16se w16cid w16 w16cex w16sdtdh w16sdtfl w16du wp14">
   <w:endnote w:type="separator" w:id="-1">
     <w:p>
       <w:pPr>
@@ -7422,7 +7884,7 @@
 </file>
 
 <file path=word/footnotes.xml><?xml version="1.0" encoding="utf-8"?>
-<w:footnotes xmlns:wpc="http://schemas.microsoft.com/office/word/2010/wordprocessingCanvas" xmlns:cx="http://schemas.microsoft.com/office/drawing/2014/chartex" xmlns:cx1="http://schemas.microsoft.com/office/drawing/2015/9/8/chartex" xmlns:cx2="http://schemas.microsoft.com/office/drawing/2015/10/21/chartex" xmlns:cx3="http://schemas.microsoft.com/office/drawing/2016/5/9/chartex" xmlns:cx4="http://schemas.microsoft.com/office/drawing/2016/5/10/chartex" xmlns:cx5="http://schemas.microsoft.com/office/drawing/2016/5/11/chartex" xmlns:cx6="http://schemas.microsoft.com/office/drawing/2016/5/12/chartex" xmlns:cx7="http://schemas.microsoft.com/office/drawing/2016/5/13/chartex" xmlns:cx8="http://schemas.microsoft.com/office/drawing/2016/5/14/chartex" xmlns:mc="http://schemas.openxmlformats.org/markup-compatibility/2006" xmlns:aink="http://schemas.microsoft.com/office/drawing/2016/ink" xmlns:am3d="http://schemas.microsoft.com/office/drawing/2017/model3d" xmlns:o="urn:schemas-microsoft-com:office:office" xmlns:r="http://schemas.openxmlformats.org/officeDocument/2006/relationships" xmlns:m="http://schemas.openxmlformats.org/officeDocument/2006/math" xmlns:v="urn:schemas-microsoft-com:vml" xmlns:wp14="http://schemas.microsoft.com/office/word/2010/wordprocessingDrawing" xmlns:wp="http://schemas.openxmlformats.org/drawingml/2006/wordprocessingDrawing" xmlns:w10="urn:schemas-microsoft-com:office:word" xmlns:w="http://schemas.openxmlformats.org/wordprocessingml/2006/main" xmlns:w14="http://schemas.microsoft.com/office/word/2010/wordml" xmlns:w15="http://schemas.microsoft.com/office/word/2012/wordml" xmlns:w16cex="http://schemas.microsoft.com/office/word/2018/wordml/cex" xmlns:w16cid="http://schemas.microsoft.com/office/word/2016/wordml/cid" xmlns:w16="http://schemas.microsoft.com/office/word/2018/wordml" xmlns:w16sdtdh="http://schemas.microsoft.com/office/word/2020/wordml/sdtdatahash" xmlns:w16se="http://schemas.microsoft.com/office/word/2015/wordml/symex" xmlns:wpg="http://schemas.microsoft.com/office/word/2010/wordprocessingGroup" xmlns:wpi="http://schemas.microsoft.com/office/word/2010/wordprocessingInk" xmlns:wne="http://schemas.microsoft.com/office/word/2006/wordml" xmlns:wps="http://schemas.microsoft.com/office/word/2010/wordprocessingShape" mc:Ignorable="w14 w15 w16se w16cid w16 w16cex w16sdtdh wp14">
+<w:footnotes xmlns:wpc="http://schemas.microsoft.com/office/word/2010/wordprocessingCanvas" xmlns:cx="http://schemas.microsoft.com/office/drawing/2014/chartex" xmlns:cx1="http://schemas.microsoft.com/office/drawing/2015/9/8/chartex" xmlns:cx2="http://schemas.microsoft.com/office/drawing/2015/10/21/chartex" xmlns:cx3="http://schemas.microsoft.com/office/drawing/2016/5/9/chartex" xmlns:cx4="http://schemas.microsoft.com/office/drawing/2016/5/10/chartex" xmlns:cx5="http://schemas.microsoft.com/office/drawing/2016/5/11/chartex" xmlns:cx6="http://schemas.microsoft.com/office/drawing/2016/5/12/chartex" xmlns:cx7="http://schemas.microsoft.com/office/drawing/2016/5/13/chartex" xmlns:cx8="http://schemas.microsoft.com/office/drawing/2016/5/14/chartex" xmlns:mc="http://schemas.openxmlformats.org/markup-compatibility/2006" xmlns:aink="http://schemas.microsoft.com/office/drawing/2016/ink" xmlns:am3d="http://schemas.microsoft.com/office/drawing/2017/model3d" xmlns:o="urn:schemas-microsoft-com:office:office" xmlns:oel="http://schemas.microsoft.com/office/2019/extlst" xmlns:r="http://schemas.openxmlformats.org/officeDocument/2006/relationships" xmlns:m="http://schemas.openxmlformats.org/officeDocument/2006/math" xmlns:v="urn:schemas-microsoft-com:vml" xmlns:wp14="http://schemas.microsoft.com/office/word/2010/wordprocessingDrawing" xmlns:wp="http://schemas.openxmlformats.org/drawingml/2006/wordprocessingDrawing" xmlns:w10="urn:schemas-microsoft-com:office:word" xmlns:w="http://schemas.openxmlformats.org/wordprocessingml/2006/main" xmlns:w14="http://schemas.microsoft.com/office/word/2010/wordml" xmlns:w15="http://schemas.microsoft.com/office/word/2012/wordml" xmlns:w16cex="http://schemas.microsoft.com/office/word/2018/wordml/cex" xmlns:w16cid="http://schemas.microsoft.com/office/word/2016/wordml/cid" xmlns:w16="http://schemas.microsoft.com/office/word/2018/wordml" xmlns:w16du="http://schemas.microsoft.com/office/word/2023/wordml/word16du" xmlns:w16sdtdh="http://schemas.microsoft.com/office/word/2020/wordml/sdtdatahash" xmlns:w16sdtfl="http://schemas.microsoft.com/office/word/2024/wordml/sdtformatlock" xmlns:w16se="http://schemas.microsoft.com/office/word/2015/wordml/symex" xmlns:wpg="http://schemas.microsoft.com/office/word/2010/wordprocessingGroup" xmlns:wpi="http://schemas.microsoft.com/office/word/2010/wordprocessingInk" xmlns:wne="http://schemas.microsoft.com/office/word/2006/wordml" xmlns:wps="http://schemas.microsoft.com/office/word/2010/wordprocessingShape" mc:Ignorable="w14 w15 w16se w16cid w16 w16cex w16sdtdh w16sdtfl w16du wp14">
   <w:footnote w:type="separator" w:id="-1">
     <w:p>
       <w:pPr>
@@ -7447,7 +7909,7 @@
 </file>
 
 <file path=word/header1.xml><?xml version="1.0" encoding="utf-8"?>
-<w:hdr xmlns:wpc="http://schemas.microsoft.com/office/word/2010/wordprocessingCanvas" xmlns:cx="http://schemas.microsoft.com/office/drawing/2014/chartex" xmlns:cx1="http://schemas.microsoft.com/office/drawing/2015/9/8/chartex" xmlns:cx2="http://schemas.microsoft.com/office/drawing/2015/10/21/chartex" xmlns:cx3="http://schemas.microsoft.com/office/drawing/2016/5/9/chartex" xmlns:cx4="http://schemas.microsoft.com/office/drawing/2016/5/10/chartex" xmlns:cx5="http://schemas.microsoft.com/office/drawing/2016/5/11/chartex" xmlns:cx6="http://schemas.microsoft.com/office/drawing/2016/5/12/chartex" xmlns:cx7="http://schemas.microsoft.com/office/drawing/2016/5/13/chartex" xmlns:cx8="http://schemas.microsoft.com/office/drawing/2016/5/14/chartex" xmlns:mc="http://schemas.openxmlformats.org/markup-compatibility/2006" xmlns:aink="http://schemas.microsoft.com/office/drawing/2016/ink" xmlns:am3d="http://schemas.microsoft.com/office/drawing/2017/model3d" xmlns:o="urn:schemas-microsoft-com:office:office" xmlns:r="http://schemas.openxmlformats.org/officeDocument/2006/relationships" xmlns:m="http://schemas.openxmlformats.org/officeDocument/2006/math" xmlns:v="urn:schemas-microsoft-com:vml" xmlns:wp14="http://schemas.microsoft.com/office/word/2010/wordprocessingDrawing" xmlns:wp="http://schemas.openxmlformats.org/drawingml/2006/wordprocessingDrawing" xmlns:w10="urn:schemas-microsoft-com:office:word" xmlns:w="http://schemas.openxmlformats.org/wordprocessingml/2006/main" xmlns:w14="http://schemas.microsoft.com/office/word/2010/wordml" xmlns:w15="http://schemas.microsoft.com/office/word/2012/wordml" xmlns:w16cex="http://schemas.microsoft.com/office/word/2018/wordml/cex" xmlns:w16cid="http://schemas.microsoft.com/office/word/2016/wordml/cid" xmlns:w16="http://schemas.microsoft.com/office/word/2018/wordml" xmlns:w16sdtdh="http://schemas.microsoft.com/office/word/2020/wordml/sdtdatahash" xmlns:w16se="http://schemas.microsoft.com/office/word/2015/wordml/symex" xmlns:wpg="http://schemas.microsoft.com/office/word/2010/wordprocessingGroup" xmlns:wpi="http://schemas.microsoft.com/office/word/2010/wordprocessingInk" xmlns:wne="http://schemas.microsoft.com/office/word/2006/wordml" xmlns:wps="http://schemas.microsoft.com/office/word/2010/wordprocessingShape" mc:Ignorable="w14 w15 w16se w16cid w16 w16cex w16sdtdh wp14">
+<w:hdr xmlns:wpc="http://schemas.microsoft.com/office/word/2010/wordprocessingCanvas" xmlns:cx="http://schemas.microsoft.com/office/drawing/2014/chartex" xmlns:cx1="http://schemas.microsoft.com/office/drawing/2015/9/8/chartex" xmlns:cx2="http://schemas.microsoft.com/office/drawing/2015/10/21/chartex" xmlns:cx3="http://schemas.microsoft.com/office/drawing/2016/5/9/chartex" xmlns:cx4="http://schemas.microsoft.com/office/drawing/2016/5/10/chartex" xmlns:cx5="http://schemas.microsoft.com/office/drawing/2016/5/11/chartex" xmlns:cx6="http://schemas.microsoft.com/office/drawing/2016/5/12/chartex" xmlns:cx7="http://schemas.microsoft.com/office/drawing/2016/5/13/chartex" xmlns:cx8="http://schemas.microsoft.com/office/drawing/2016/5/14/chartex" xmlns:mc="http://schemas.openxmlformats.org/markup-compatibility/2006" xmlns:aink="http://schemas.microsoft.com/office/drawing/2016/ink" xmlns:am3d="http://schemas.microsoft.com/office/drawing/2017/model3d" xmlns:o="urn:schemas-microsoft-com:office:office" xmlns:oel="http://schemas.microsoft.com/office/2019/extlst" xmlns:r="http://schemas.openxmlformats.org/officeDocument/2006/relationships" xmlns:m="http://schemas.openxmlformats.org/officeDocument/2006/math" xmlns:v="urn:schemas-microsoft-com:vml" xmlns:wp14="http://schemas.microsoft.com/office/word/2010/wordprocessingDrawing" xmlns:wp="http://schemas.openxmlformats.org/drawingml/2006/wordprocessingDrawing" xmlns:w10="urn:schemas-microsoft-com:office:word" xmlns:w="http://schemas.openxmlformats.org/wordprocessingml/2006/main" xmlns:w14="http://schemas.microsoft.com/office/word/2010/wordml" xmlns:w15="http://schemas.microsoft.com/office/word/2012/wordml" xmlns:w16cex="http://schemas.microsoft.com/office/word/2018/wordml/cex" xmlns:w16cid="http://schemas.microsoft.com/office/word/2016/wordml/cid" xmlns:w16="http://schemas.microsoft.com/office/word/2018/wordml" xmlns:w16du="http://schemas.microsoft.com/office/word/2023/wordml/word16du" xmlns:w16sdtdh="http://schemas.microsoft.com/office/word/2020/wordml/sdtdatahash" xmlns:w16sdtfl="http://schemas.microsoft.com/office/word/2024/wordml/sdtformatlock" xmlns:w16se="http://schemas.microsoft.com/office/word/2015/wordml/symex" xmlns:wpg="http://schemas.microsoft.com/office/word/2010/wordprocessingGroup" xmlns:wpi="http://schemas.microsoft.com/office/word/2010/wordprocessingInk" xmlns:wne="http://schemas.microsoft.com/office/word/2006/wordml" xmlns:wps="http://schemas.microsoft.com/office/word/2010/wordprocessingShape" mc:Ignorable="w14 w15 w16se w16cid w16 w16cex w16sdtdh w16sdtfl w16du wp14">
   <w:p>
     <w:pPr>
       <w:pBdr>
@@ -7513,7 +7975,7 @@
 </file>
 
 <file path=word/numbering.xml><?xml version="1.0" encoding="utf-8"?>
-<w:numbering xmlns:wpc="http://schemas.microsoft.com/office/word/2010/wordprocessingCanvas" xmlns:cx="http://schemas.microsoft.com/office/drawing/2014/chartex" xmlns:cx1="http://schemas.microsoft.com/office/drawing/2015/9/8/chartex" xmlns:cx2="http://schemas.microsoft.com/office/drawing/2015/10/21/chartex" xmlns:cx3="http://schemas.microsoft.com/office/drawing/2016/5/9/chartex" xmlns:cx4="http://schemas.microsoft.com/office/drawing/2016/5/10/chartex" xmlns:cx5="http://schemas.microsoft.com/office/drawing/2016/5/11/chartex" xmlns:cx6="http://schemas.microsoft.com/office/drawing/2016/5/12/chartex" xmlns:cx7="http://schemas.microsoft.com/office/drawing/2016/5/13/chartex" xmlns:cx8="http://schemas.microsoft.com/office/drawing/2016/5/14/chartex" xmlns:mc="http://schemas.openxmlformats.org/markup-compatibility/2006" xmlns:aink="http://schemas.microsoft.com/office/drawing/2016/ink" xmlns:am3d="http://schemas.microsoft.com/office/drawing/2017/model3d" xmlns:o="urn:schemas-microsoft-com:office:office" xmlns:r="http://schemas.openxmlformats.org/officeDocument/2006/relationships" xmlns:m="http://schemas.openxmlformats.org/officeDocument/2006/math" xmlns:v="urn:schemas-microsoft-com:vml" xmlns:wp14="http://schemas.microsoft.com/office/word/2010/wordprocessingDrawing" xmlns:wp="http://schemas.openxmlformats.org/drawingml/2006/wordprocessingDrawing" xmlns:w10="urn:schemas-microsoft-com:office:word" xmlns:w="http://schemas.openxmlformats.org/wordprocessingml/2006/main" xmlns:w14="http://schemas.microsoft.com/office/word/2010/wordml" xmlns:w15="http://schemas.microsoft.com/office/word/2012/wordml" xmlns:w16cex="http://schemas.microsoft.com/office/word/2018/wordml/cex" xmlns:w16cid="http://schemas.microsoft.com/office/word/2016/wordml/cid" xmlns:w16="http://schemas.microsoft.com/office/word/2018/wordml" xmlns:w16sdtdh="http://schemas.microsoft.com/office/word/2020/wordml/sdtdatahash" xmlns:w16se="http://schemas.microsoft.com/office/word/2015/wordml/symex" xmlns:wpg="http://schemas.microsoft.com/office/word/2010/wordprocessingGroup" xmlns:wpi="http://schemas.microsoft.com/office/word/2010/wordprocessingInk" xmlns:wne="http://schemas.microsoft.com/office/word/2006/wordml" xmlns:wps="http://schemas.microsoft.com/office/word/2010/wordprocessingShape" mc:Ignorable="w14 w15 w16se w16cid w16 w16cex w16sdtdh wp14">
+<w:numbering xmlns:wpc="http://schemas.microsoft.com/office/word/2010/wordprocessingCanvas" xmlns:cx="http://schemas.microsoft.com/office/drawing/2014/chartex" xmlns:cx1="http://schemas.microsoft.com/office/drawing/2015/9/8/chartex" xmlns:cx2="http://schemas.microsoft.com/office/drawing/2015/10/21/chartex" xmlns:cx3="http://schemas.microsoft.com/office/drawing/2016/5/9/chartex" xmlns:cx4="http://schemas.microsoft.com/office/drawing/2016/5/10/chartex" xmlns:cx5="http://schemas.microsoft.com/office/drawing/2016/5/11/chartex" xmlns:cx6="http://schemas.microsoft.com/office/drawing/2016/5/12/chartex" xmlns:cx7="http://schemas.microsoft.com/office/drawing/2016/5/13/chartex" xmlns:cx8="http://schemas.microsoft.com/office/drawing/2016/5/14/chartex" xmlns:mc="http://schemas.openxmlformats.org/markup-compatibility/2006" xmlns:aink="http://schemas.microsoft.com/office/drawing/2016/ink" xmlns:am3d="http://schemas.microsoft.com/office/drawing/2017/model3d" xmlns:o="urn:schemas-microsoft-com:office:office" xmlns:oel="http://schemas.microsoft.com/office/2019/extlst" xmlns:r="http://schemas.openxmlformats.org/officeDocument/2006/relationships" xmlns:m="http://schemas.openxmlformats.org/officeDocument/2006/math" xmlns:v="urn:schemas-microsoft-com:vml" xmlns:wp14="http://schemas.microsoft.com/office/word/2010/wordprocessingDrawing" xmlns:wp="http://schemas.openxmlformats.org/drawingml/2006/wordprocessingDrawing" xmlns:w10="urn:schemas-microsoft-com:office:word" xmlns:w="http://schemas.openxmlformats.org/wordprocessingml/2006/main" xmlns:w14="http://schemas.microsoft.com/office/word/2010/wordml" xmlns:w15="http://schemas.microsoft.com/office/word/2012/wordml" xmlns:w16cex="http://schemas.microsoft.com/office/word/2018/wordml/cex" xmlns:w16cid="http://schemas.microsoft.com/office/word/2016/wordml/cid" xmlns:w16="http://schemas.microsoft.com/office/word/2018/wordml" xmlns:w16du="http://schemas.microsoft.com/office/word/2023/wordml/word16du" xmlns:w16sdtdh="http://schemas.microsoft.com/office/word/2020/wordml/sdtdatahash" xmlns:w16sdtfl="http://schemas.microsoft.com/office/word/2024/wordml/sdtformatlock" xmlns:w16se="http://schemas.microsoft.com/office/word/2015/wordml/symex" xmlns:wpg="http://schemas.microsoft.com/office/word/2010/wordprocessingGroup" xmlns:wpi="http://schemas.microsoft.com/office/word/2010/wordprocessingInk" xmlns:wne="http://schemas.microsoft.com/office/word/2006/wordml" xmlns:wps="http://schemas.microsoft.com/office/word/2010/wordprocessingShape" mc:Ignorable="w14 w15 w16se w16cid w16 w16cex w16sdtdh w16sdtfl w16du wp14">
   <w:abstractNum w:abstractNumId="0" w15:restartNumberingAfterBreak="0">
     <w:nsid w:val="63F335F7"/>
     <w:multiLevelType w:val="hybridMultilevel"/>
@@ -7802,20 +8264,20 @@
       </w:pPr>
     </w:lvl>
   </w:abstractNum>
-  <w:num w:numId="1">
+  <w:num w:numId="1" w16cid:durableId="1713847536">
     <w:abstractNumId w:val="1"/>
   </w:num>
-  <w:num w:numId="2">
+  <w:num w:numId="2" w16cid:durableId="48843739">
     <w:abstractNumId w:val="0"/>
   </w:num>
-  <w:num w:numId="3">
+  <w:num w:numId="3" w16cid:durableId="626932867">
     <w:abstractNumId w:val="2"/>
   </w:num>
 </w:numbering>
 </file>
 
 <file path=word/styles.xml><?xml version="1.0" encoding="utf-8"?>
-<w:styles xmlns:mc="http://schemas.openxmlformats.org/markup-compatibility/2006" xmlns:r="http://schemas.openxmlformats.org/officeDocument/2006/relationships" xmlns:w="http://schemas.openxmlformats.org/wordprocessingml/2006/main" xmlns:w14="http://schemas.microsoft.com/office/word/2010/wordml" xmlns:w15="http://schemas.microsoft.com/office/word/2012/wordml" xmlns:w16cex="http://schemas.microsoft.com/office/word/2018/wordml/cex" xmlns:w16cid="http://schemas.microsoft.com/office/word/2016/wordml/cid" xmlns:w16="http://schemas.microsoft.com/office/word/2018/wordml" xmlns:w16sdtdh="http://schemas.microsoft.com/office/word/2020/wordml/sdtdatahash" xmlns:w16se="http://schemas.microsoft.com/office/word/2015/wordml/symex" mc:Ignorable="w14 w15 w16se w16cid w16 w16cex w16sdtdh">
+<w:styles xmlns:mc="http://schemas.openxmlformats.org/markup-compatibility/2006" xmlns:r="http://schemas.openxmlformats.org/officeDocument/2006/relationships" xmlns:w="http://schemas.openxmlformats.org/wordprocessingml/2006/main" xmlns:w14="http://schemas.microsoft.com/office/word/2010/wordml" xmlns:w15="http://schemas.microsoft.com/office/word/2012/wordml" xmlns:w16cex="http://schemas.microsoft.com/office/word/2018/wordml/cex" xmlns:w16cid="http://schemas.microsoft.com/office/word/2016/wordml/cid" xmlns:w16="http://schemas.microsoft.com/office/word/2018/wordml" xmlns:w16du="http://schemas.microsoft.com/office/word/2023/wordml/word16du" xmlns:w16sdtdh="http://schemas.microsoft.com/office/word/2020/wordml/sdtdatahash" xmlns:w16sdtfl="http://schemas.microsoft.com/office/word/2024/wordml/sdtformatlock" xmlns:w16se="http://schemas.microsoft.com/office/word/2015/wordml/symex" mc:Ignorable="w14 w15 w16se w16cid w16 w16cex w16sdtdh w16sdtfl w16du">
   <w:docDefaults>
     <w:rPrDefault>
       <w:rPr>
@@ -8337,7 +8799,6 @@
   <w:style w:type="character" w:default="1" w:styleId="Fontepargpadro">
     <w:name w:val="Default Paragraph Font"/>
     <w:uiPriority w:val="1"/>
-    <w:semiHidden/>
     <w:unhideWhenUsed/>
   </w:style>
   <w:style w:type="table" w:default="1" w:styleId="Tabelanormal">
@@ -8859,28 +9320,28 @@
 </file>
 
 <file path=customXml/item1.xml><?xml version="1.0" encoding="utf-8"?>
+<b:Sources xmlns:b="http://schemas.openxmlformats.org/officeDocument/2006/bibliography" xmlns="http://schemas.openxmlformats.org/officeDocument/2006/bibliography" SelectedStyle="\APASixthEditionOfficeOnline.xsl" StyleName="APA" Version="6"/>
+</file>
+
+<file path=customXml/item2.xml><?xml version="1.0" encoding="utf-8"?>
 <go:gDocsCustomXmlDataStorage xmlns:go="http://customooxmlschemas.google.com/" xmlns:r="http://schemas.openxmlformats.org/officeDocument/2006/relationships" uri="GoogleDocsCustomDataVersion2">
   <go:docsCustomData xmlns:go="http://customooxmlschemas.google.com/" roundtripDataSignature="AMtx7mhjMfHsTVXexaUkkMpLzW2xHgQflg==">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</go:docsCustomData>
 </go:gDocsCustomXmlDataStorage>
 </file>
 
-<file path=customXml/item2.xml><?xml version="1.0" encoding="utf-8"?>
-<b:Sources xmlns:b="http://schemas.openxmlformats.org/officeDocument/2006/bibliography" xmlns="http://schemas.openxmlformats.org/officeDocument/2006/bibliography" SelectedStyle="\APASixthEditionOfficeOnline.xsl" StyleName="APA" Version="6"/>
+<file path=customXml/itemProps1.xml><?xml version="1.0" encoding="utf-8"?>
+<ds:datastoreItem xmlns:ds="http://schemas.openxmlformats.org/officeDocument/2006/customXml" ds:itemID="{594D1ADB-9B24-4A91-A416-1AADFD833A27}">
+  <ds:schemaRefs>
+    <ds:schemaRef ds:uri="http://schemas.openxmlformats.org/officeDocument/2006/bibliography"/>
+  </ds:schemaRefs>
+</ds:datastoreItem>
 </file>
 
-<file path=customXml/itemProps1.xml><?xml version="1.0" encoding="utf-8"?>
+<file path=customXml/itemProps2.xml><?xml version="1.0" encoding="utf-8"?>
 <ds:datastoreItem xmlns:ds="http://schemas.openxmlformats.org/officeDocument/2006/customXml" ds:itemID="{11111111-1234-1234-1234-123412341234}">
   <ds:schemaRefs>
     <ds:schemaRef ds:uri="http://customooxmlschemas.google.com/"/>
     <ds:schemaRef ds:uri="http://schemas.openxmlformats.org/officeDocument/2006/relationships"/>
   </ds:schemaRefs>
 </ds:datastoreItem>
-</file>
-
-<file path=customXml/itemProps2.xml><?xml version="1.0" encoding="utf-8"?>
-<ds:datastoreItem xmlns:ds="http://schemas.openxmlformats.org/officeDocument/2006/customXml" ds:itemID="{594D1ADB-9B24-4A91-A416-1AADFD833A27}">
-  <ds:schemaRefs>
-    <ds:schemaRef ds:uri="http://schemas.openxmlformats.org/officeDocument/2006/bibliography"/>
-  </ds:schemaRefs>
-</ds:datastoreItem>
 </file>
</xml_diff>